<commit_message>
updated documenation and few tracebality
</commit_message>
<xml_diff>
--- a/docs/Mission Planner.docx
+++ b/docs/Mission Planner.docx
@@ -4937,46 +4937,6 @@
           </w:p>
         </w:tc>
       </w:tr>
-      <w:tr>
-        <w:tc>
-          <w:tcPr>
-            <w:tcW w:w="950" w:type="pct"/>
-          </w:tcPr>
-          <w:p>
-            <w:pPr>
-              <w:pStyle w:val="CellBody"/>
-            </w:pPr>
-            <w:r>
-              <w:t>SYS-010</w:t>
-            </w:r>
-          </w:p>
-        </w:tc>
-        <w:tc>
-          <w:tcPr>
-            <w:tcW w:w="4050" w:type="pct"/>
-          </w:tcPr>
-          <w:p>
-            <w:pPr>
-              <w:pStyle w:val="CellBody"/>
-            </w:pPr>
-            <w:r>
-              <w:t xml:space="preserve">The system shall </w:t>
-            </w:r>
-            <w:r>
-              <w:t>maintain</w:t>
-            </w:r>
-            <w:r>
-              <w:t xml:space="preserve"> </w:t>
-            </w:r>
-            <w:r>
-              <w:t xml:space="preserve">source control </w:t>
-            </w:r>
-            <w:r>
-              <w:t>using Git.</w:t>
-            </w:r>
-          </w:p>
-        </w:tc>
-      </w:tr>
     </w:tbl>
     <w:p>
       <w:pPr>
@@ -5419,7 +5379,7 @@
               <w:t>SYS-00</w:t>
             </w:r>
             <w:r>
-              <w:t>5</w:t>
+              <w:t>6</w:t>
             </w:r>
             <w:r>
               <w:t xml:space="preserve">       </w:t>
@@ -6209,7 +6169,7 @@
               </w:rPr>
             </w:pPr>
             <w:r>
-              <w:t>The mission subsystem shall reject missions where consecutive waypoints at identical positions</w:t>
+              <w:t>The mission subsystem shall reject missions where any consecutive waypoints are separated by a Euclidean distance of less than 0.001 coordinate units.</w:t>
             </w:r>
           </w:p>
         </w:tc>
@@ -6744,7 +6704,13 @@
               <w:t>”</w:t>
             </w:r>
             <w:r>
-              <w:t xml:space="preserve"> shall a </w:t>
+              <w:t xml:space="preserve"> shall </w:t>
+            </w:r>
+            <w:r>
+              <w:t xml:space="preserve">be </w:t>
+            </w:r>
+            <w:r>
+              <w:t xml:space="preserve">a </w:t>
             </w:r>
             <w:r>
               <w:t>struct with fields: index, type, x, y altitude</w:t>
@@ -7307,6 +7273,7 @@
               <w:pStyle w:val="CellBody"/>
             </w:pPr>
             <w:r>
+              <w:lastRenderedPageBreak/>
               <w:t xml:space="preserve">SDD-014 </w:t>
             </w:r>
           </w:p>
@@ -7320,7 +7287,24 @@
               <w:pStyle w:val="CellBody"/>
             </w:pPr>
             <w:r>
-              <w:t>SRD-022</w:t>
+              <w:t>SRD-0</w:t>
+            </w:r>
+            <w:r>
+              <w:t>14</w:t>
+            </w:r>
+          </w:p>
+          <w:p>
+            <w:pPr>
+              <w:pStyle w:val="CellBody"/>
+            </w:pPr>
+            <w:r>
+              <w:t>SRD-0</w:t>
+            </w:r>
+            <w:r>
+              <w:t>1</w:t>
+            </w:r>
+            <w:r>
+              <w:t>5</w:t>
             </w:r>
           </w:p>
         </w:tc>
@@ -7371,7 +7355,6 @@
       </w:pPr>
       <w:bookmarkStart w:id="219" w:name="_Toc230284469"/>
       <w:r>
-        <w:lastRenderedPageBreak/>
         <w:t xml:space="preserve">Map </w:t>
       </w:r>
       <w:r>
@@ -8671,13 +8654,7 @@
               <w:pStyle w:val="CellBody"/>
             </w:pPr>
             <w:r>
-              <w:t xml:space="preserve">The status bar </w:t>
-            </w:r>
-            <w:r>
-              <w:t>shall</w:t>
-            </w:r>
-            <w:r>
-              <w:t xml:space="preserve"> show a message that says "Click the map to place waypoints" when there are no waypoints.</w:t>
+              <w:t>The status bar shall show a message that says "Click the map to place waypoints" when there are no waypoints.</w:t>
             </w:r>
           </w:p>
         </w:tc>
@@ -8692,6 +8669,7 @@
               <w:pStyle w:val="CellBody"/>
             </w:pPr>
             <w:r>
+              <w:lastRenderedPageBreak/>
               <w:t>SDD-0</w:t>
             </w:r>
             <w:r>
@@ -9165,7 +9143,13 @@
               <w:pStyle w:val="CellBody"/>
             </w:pPr>
             <w:r>
-              <w:t>TEST-0</w:t>
+              <w:t>TEST-</w:t>
+            </w:r>
+            <w:r>
+              <w:t>0</w:t>
+            </w:r>
+            <w:r>
+              <w:t>0</w:t>
             </w:r>
             <w:r>
               <w:t>1</w:t>
@@ -9241,7 +9225,13 @@
               <w:pStyle w:val="CellBody"/>
             </w:pPr>
             <w:r>
-              <w:t>TEST-0</w:t>
+              <w:t>TEST-</w:t>
+            </w:r>
+            <w:r>
+              <w:t>0</w:t>
+            </w:r>
+            <w:r>
+              <w:t>0</w:t>
             </w:r>
             <w:r>
               <w:t>2</w:t>
@@ -9323,7 +9313,13 @@
               <w:pStyle w:val="CellBody"/>
             </w:pPr>
             <w:r>
-              <w:t>TEST-0</w:t>
+              <w:t>TEST-</w:t>
+            </w:r>
+            <w:r>
+              <w:t>0</w:t>
+            </w:r>
+            <w:r>
+              <w:t>0</w:t>
             </w:r>
             <w:r>
               <w:t>3</w:t>
@@ -9396,7 +9392,13 @@
               <w:pStyle w:val="CellBody"/>
             </w:pPr>
             <w:r>
-              <w:t>TEST-0</w:t>
+              <w:t>TEST-</w:t>
+            </w:r>
+            <w:r>
+              <w:t>0</w:t>
+            </w:r>
+            <w:r>
+              <w:t>0</w:t>
             </w:r>
             <w:r>
               <w:t>4</w:t>
@@ -9477,7 +9479,13 @@
               <w:pStyle w:val="CellBody"/>
             </w:pPr>
             <w:r>
-              <w:t>TEST-0</w:t>
+              <w:t>TEST-</w:t>
+            </w:r>
+            <w:r>
+              <w:t>0</w:t>
+            </w:r>
+            <w:r>
+              <w:t>0</w:t>
             </w:r>
             <w:r>
               <w:t>5</w:t>
@@ -9550,7 +9558,13 @@
               <w:pStyle w:val="CellBody"/>
             </w:pPr>
             <w:r>
-              <w:t>TEST-0</w:t>
+              <w:t>TEST-</w:t>
+            </w:r>
+            <w:r>
+              <w:t>0</w:t>
+            </w:r>
+            <w:r>
+              <w:t>0</w:t>
             </w:r>
             <w:r>
               <w:t>6</w:t>
@@ -9580,7 +9594,7 @@
               <w:pStyle w:val="CellBody"/>
             </w:pPr>
             <w:r>
-              <w:t>Nominal</w:t>
+              <w:t>Robust</w:t>
             </w:r>
           </w:p>
         </w:tc>
@@ -9685,7 +9699,13 @@
               <w:pStyle w:val="CellBody"/>
             </w:pPr>
             <w:r>
-              <w:t>TEST-0</w:t>
+              <w:t>TEST-</w:t>
+            </w:r>
+            <w:r>
+              <w:t>0</w:t>
+            </w:r>
+            <w:r>
+              <w:t>0</w:t>
             </w:r>
             <w:r>
               <w:t>7</w:t>
@@ -9938,7 +9958,13 @@
               <w:pStyle w:val="CellBody"/>
             </w:pPr>
             <w:r>
-              <w:t>TEST-0</w:t>
+              <w:t>TEST-</w:t>
+            </w:r>
+            <w:r>
+              <w:t>0</w:t>
+            </w:r>
+            <w:r>
+              <w:t>0</w:t>
             </w:r>
             <w:r>
               <w:t>8</w:t>
@@ -10105,7 +10131,13 @@
               <w:pStyle w:val="CellBody"/>
             </w:pPr>
             <w:r>
-              <w:t>TEST-0</w:t>
+              <w:t>TEST-</w:t>
+            </w:r>
+            <w:r>
+              <w:t>0</w:t>
+            </w:r>
+            <w:r>
+              <w:t>0</w:t>
             </w:r>
             <w:r>
               <w:t>9</w:t>
@@ -10147,7 +10179,7 @@
               <w:pStyle w:val="CellBody"/>
             </w:pPr>
             <w:r>
-              <w:t>Nominal</w:t>
+              <w:t>Robust</w:t>
             </w:r>
           </w:p>
         </w:tc>
@@ -10660,26 +10692,7 @@
               <w:t>SDD-00</w:t>
             </w:r>
             <w:r>
-              <w:t>1</w:t>
-            </w:r>
-          </w:p>
-          <w:p>
-            <w:pPr>
-              <w:pStyle w:val="CellBody"/>
-            </w:pPr>
-            <w:r>
-              <w:t>SDD-00</w:t>
-            </w:r>
-            <w:r>
               <w:t>3</w:t>
-            </w:r>
-          </w:p>
-          <w:p>
-            <w:pPr>
-              <w:pStyle w:val="CellBody"/>
-            </w:pPr>
-            <w:r>
-              <w:t>SRD-010</w:t>
             </w:r>
           </w:p>
         </w:tc>
@@ -10838,23 +10851,7 @@
               <w:pStyle w:val="CellBody"/>
             </w:pPr>
             <w:r>
-              <w:t>SDD-001</w:t>
-            </w:r>
-          </w:p>
-          <w:p>
-            <w:pPr>
-              <w:pStyle w:val="CellBody"/>
-            </w:pPr>
-            <w:r>
               <w:t>SDD-004, SDD-005</w:t>
-            </w:r>
-          </w:p>
-          <w:p>
-            <w:pPr>
-              <w:pStyle w:val="CellBody"/>
-            </w:pPr>
-            <w:r>
-              <w:t>SRD-010</w:t>
             </w:r>
           </w:p>
         </w:tc>
@@ -11301,7 +11298,6 @@
               <w:pStyle w:val="CellBody"/>
             </w:pPr>
             <w:r>
-              <w:lastRenderedPageBreak/>
               <w:t>TEST-0</w:t>
             </w:r>
             <w:r>
@@ -11551,6 +11547,7 @@
               <w:pStyle w:val="CellBody"/>
             </w:pPr>
             <w:r>
+              <w:lastRenderedPageBreak/>
               <w:t>TEST-0</w:t>
             </w:r>
             <w:r>
@@ -11818,7 +11815,7 @@
                 <w:lang w:val="en-US"/>
                 <w14:ligatures w14:val="none"/>
               </w:rPr>
-              <w:t>SDD-014, SRD-022</w:t>
+              <w:t>SDD-014</w:t>
             </w:r>
           </w:p>
         </w:tc>
@@ -11983,7 +11980,7 @@
                 <w:lang w:val="en-US"/>
                 <w14:ligatures w14:val="none"/>
               </w:rPr>
-              <w:t>SDD-014, SRD-022</w:t>
+              <w:t>SDD-014</w:t>
             </w:r>
           </w:p>
         </w:tc>
@@ -13281,15 +13278,7 @@
               <w:pStyle w:val="CellBody"/>
             </w:pPr>
             <w:r>
-              <w:t>TEST-001 to TEST-011, TR-</w:t>
-            </w:r>
-            <w:proofErr w:type="gramStart"/>
-            <w:r>
-              <w:t>014..</w:t>
-            </w:r>
-            <w:proofErr w:type="gramEnd"/>
-            <w:r>
-              <w:t>TR-016</w:t>
+              <w:t>TEST-001 to TEST-011</w:t>
             </w:r>
           </w:p>
         </w:tc>
@@ -13351,15 +13340,7 @@
               <w:pStyle w:val="CellBody"/>
             </w:pPr>
             <w:r>
-              <w:t>TEST-</w:t>
-            </w:r>
-            <w:proofErr w:type="gramStart"/>
-            <w:r>
-              <w:t>014,TEST</w:t>
-            </w:r>
-            <w:proofErr w:type="gramEnd"/>
-            <w:r>
-              <w:t>-015, TEST-016</w:t>
+              <w:t>GUI</w:t>
             </w:r>
           </w:p>
         </w:tc>
@@ -13481,8 +13462,16 @@
             <w:pPr>
               <w:pStyle w:val="CellBody"/>
             </w:pPr>
-            <w:r>
-              <w:t>tests/tst_missionmanager.cpp</w:t>
+            <w:proofErr w:type="spellStart"/>
+            <w:r>
+              <w:t>missionPlanTest</w:t>
+            </w:r>
+            <w:proofErr w:type="spellEnd"/>
+            <w:r>
+              <w:t>/tst_testmissionplanner</w:t>
+            </w:r>
+            <w:r>
+              <w:t>.cpp</w:t>
             </w:r>
           </w:p>
         </w:tc>
@@ -13496,7 +13485,7 @@
               <w:pStyle w:val="CellBody"/>
             </w:pPr>
             <w:r>
-              <w:t>TEST-0001 to TEST-0025</w:t>
+              <w:t>TEST-001 to TEST-025</w:t>
             </w:r>
           </w:p>
         </w:tc>
@@ -13559,7 +13548,7 @@
               <w:pStyle w:val="CellBody"/>
             </w:pPr>
             <w:r>
-              <w:t>SYS-010</w:t>
+              <w:t>SRD-001</w:t>
             </w:r>
           </w:p>
         </w:tc>
@@ -13572,40 +13561,40 @@
             <w:pPr>
               <w:pStyle w:val="CellBody"/>
             </w:pPr>
-            <w:r>
-              <w:rPr>
-                <w:lang w:val="en-IN"/>
-              </w:rPr>
-              <w:t>Git repository setup (.git</w:t>
-            </w:r>
+            <w:proofErr w:type="spellStart"/>
             <w:proofErr w:type="gramStart"/>
             <w:r>
-              <w:rPr>
-                <w:lang w:val="en-IN"/>
-              </w:rPr>
-              <w:t>)</w:t>
-            </w:r>
-            <w:r>
-              <w:rPr>
-                <w:lang w:val="en-IN"/>
-              </w:rPr>
-              <w:t xml:space="preserve"> </w:t>
-            </w:r>
-            <w:r>
-              <w:rPr>
-                <w:lang w:val="en-IN"/>
-              </w:rPr>
-              <w:t>.</w:t>
+              <w:t>MapEngine</w:t>
+            </w:r>
+            <w:proofErr w:type="spellEnd"/>
+            <w:r>
+              <w:t>::</w:t>
             </w:r>
             <w:proofErr w:type="spellStart"/>
             <w:r>
-              <w:rPr>
-                <w:lang w:val="en-IN"/>
-              </w:rPr>
-              <w:t>gitignore</w:t>
+              <w:t>MapEngine</w:t>
             </w:r>
             <w:proofErr w:type="spellEnd"/>
+            <w:r>
+              <w:t>(</w:t>
+            </w:r>
             <w:proofErr w:type="gramEnd"/>
+            <w:r>
+              <w:t xml:space="preserve">), </w:t>
+            </w:r>
+            <w:proofErr w:type="spellStart"/>
+            <w:proofErr w:type="gramStart"/>
+            <w:r>
+              <w:t>drawGrid</w:t>
+            </w:r>
+            <w:proofErr w:type="spellEnd"/>
+            <w:r>
+              <w:t>(</w:t>
+            </w:r>
+            <w:proofErr w:type="gramEnd"/>
+            <w:r>
+              <w:t>) [SDD-020]</w:t>
+            </w:r>
           </w:p>
         </w:tc>
         <w:tc>
@@ -13618,10 +13607,7 @@
               <w:pStyle w:val="CellBody"/>
             </w:pPr>
             <w:r>
-              <w:rPr>
-                <w:lang w:val="en-IN"/>
-              </w:rPr>
-              <w:t>Process audit / repository inspection</w:t>
+              <w:t>GUI</w:t>
             </w:r>
           </w:p>
         </w:tc>
@@ -13637,7 +13623,7 @@
               <w:pStyle w:val="CellBody"/>
             </w:pPr>
             <w:r>
-              <w:t>SRD-001</w:t>
+              <w:t>SRD-002</w:t>
             </w:r>
           </w:p>
         </w:tc>
@@ -13661,7 +13647,7 @@
             </w:r>
             <w:proofErr w:type="spellStart"/>
             <w:r>
-              <w:t>MapEngine</w:t>
+              <w:t>mousePressEvent</w:t>
             </w:r>
             <w:proofErr w:type="spellEnd"/>
             <w:r>
@@ -13669,20 +13655,69 @@
             </w:r>
             <w:proofErr w:type="gramEnd"/>
             <w:r>
-              <w:t xml:space="preserve">), </w:t>
-            </w:r>
+              <w:t>) [SDD-021]</w:t>
+            </w:r>
+          </w:p>
+        </w:tc>
+        <w:tc>
+          <w:tcPr>
+            <w:tcW w:w="1868" w:type="pct"/>
+            <w:vAlign w:val="bottom"/>
+          </w:tcPr>
+          <w:p>
+            <w:pPr>
+              <w:pStyle w:val="CellBody"/>
+            </w:pPr>
+            <w:r>
+              <w:t>GUI</w:t>
+            </w:r>
+          </w:p>
+        </w:tc>
+      </w:tr>
+      <w:tr>
+        <w:tc>
+          <w:tcPr>
+            <w:tcW w:w="862" w:type="pct"/>
+            <w:vAlign w:val="bottom"/>
+          </w:tcPr>
+          <w:p>
+            <w:pPr>
+              <w:pStyle w:val="CellBody"/>
+            </w:pPr>
+            <w:r>
+              <w:t>SRD-003</w:t>
+            </w:r>
+          </w:p>
+        </w:tc>
+        <w:tc>
+          <w:tcPr>
+            <w:tcW w:w="2270" w:type="pct"/>
+            <w:vAlign w:val="bottom"/>
+          </w:tcPr>
+          <w:p>
+            <w:pPr>
+              <w:pStyle w:val="CellBody"/>
+            </w:pPr>
             <w:proofErr w:type="spellStart"/>
             <w:proofErr w:type="gramStart"/>
             <w:r>
-              <w:t>drawGrid</w:t>
+              <w:t>MapEngine</w:t>
             </w:r>
             <w:proofErr w:type="spellEnd"/>
             <w:r>
+              <w:t>::</w:t>
+            </w:r>
+            <w:proofErr w:type="spellStart"/>
+            <w:r>
+              <w:t>redrawLines</w:t>
+            </w:r>
+            <w:proofErr w:type="spellEnd"/>
+            <w:r>
               <w:t>(</w:t>
             </w:r>
             <w:proofErr w:type="gramEnd"/>
             <w:r>
-              <w:t>) [SDD-020]</w:t>
+              <w:t>) [SDD-022]</w:t>
             </w:r>
           </w:p>
         </w:tc>
@@ -13712,7 +13747,7 @@
               <w:pStyle w:val="CellBody"/>
             </w:pPr>
             <w:r>
-              <w:t>SRD-002</w:t>
+              <w:t>SRD-004</w:t>
             </w:r>
           </w:p>
         </w:tc>
@@ -13736,7 +13771,7 @@
             </w:r>
             <w:proofErr w:type="spellStart"/>
             <w:r>
-              <w:t>mousePressEvent</w:t>
+              <w:t>refreshColors</w:t>
             </w:r>
             <w:proofErr w:type="spellEnd"/>
             <w:r>
@@ -13744,7 +13779,7 @@
             </w:r>
             <w:proofErr w:type="gramEnd"/>
             <w:r>
-              <w:t>) [SDD-021]</w:t>
+              <w:t>) [SDD-023]</w:t>
             </w:r>
           </w:p>
         </w:tc>
@@ -13774,7 +13809,7 @@
               <w:pStyle w:val="CellBody"/>
             </w:pPr>
             <w:r>
-              <w:t>SRD-003</w:t>
+              <w:t>SRD-005</w:t>
             </w:r>
           </w:p>
         </w:tc>
@@ -13798,7 +13833,7 @@
             </w:r>
             <w:proofErr w:type="spellStart"/>
             <w:r>
-              <w:t>redrawLines</w:t>
+              <w:t>removeLastWaypoint</w:t>
             </w:r>
             <w:proofErr w:type="spellEnd"/>
             <w:r>
@@ -13806,7 +13841,7 @@
             </w:r>
             <w:proofErr w:type="gramEnd"/>
             <w:r>
-              <w:t>) [SDD-022]</w:t>
+              <w:t>) [SDD-024]</w:t>
             </w:r>
           </w:p>
         </w:tc>
@@ -13820,7 +13855,7 @@
               <w:pStyle w:val="CellBody"/>
             </w:pPr>
             <w:r>
-              <w:t>GUI</w:t>
+              <w:t>TEST-024</w:t>
             </w:r>
           </w:p>
         </w:tc>
@@ -13836,7 +13871,7 @@
               <w:pStyle w:val="CellBody"/>
             </w:pPr>
             <w:r>
-              <w:t>SRD-004</w:t>
+              <w:t>SRD-006</w:t>
             </w:r>
           </w:p>
         </w:tc>
@@ -13860,7 +13895,7 @@
             </w:r>
             <w:proofErr w:type="spellStart"/>
             <w:r>
-              <w:t>refreshColors</w:t>
+              <w:t>clearAll</w:t>
             </w:r>
             <w:proofErr w:type="spellEnd"/>
             <w:r>
@@ -13868,7 +13903,20 @@
             </w:r>
             <w:proofErr w:type="gramEnd"/>
             <w:r>
-              <w:t>) [SDD-023]</w:t>
+              <w:t xml:space="preserve">) [SDD-025], </w:t>
+            </w:r>
+            <w:proofErr w:type="spellStart"/>
+            <w:proofErr w:type="gramStart"/>
+            <w:r>
+              <w:t>MissionManager</w:t>
+            </w:r>
+            <w:proofErr w:type="spellEnd"/>
+            <w:r>
+              <w:t>::clear(</w:t>
+            </w:r>
+            <w:proofErr w:type="gramEnd"/>
+            <w:r>
+              <w:t>)</w:t>
             </w:r>
           </w:p>
         </w:tc>
@@ -13882,7 +13930,7 @@
               <w:pStyle w:val="CellBody"/>
             </w:pPr>
             <w:r>
-              <w:t>GUI</w:t>
+              <w:t>TEST-025</w:t>
             </w:r>
           </w:p>
         </w:tc>
@@ -13898,7 +13946,7 @@
               <w:pStyle w:val="CellBody"/>
             </w:pPr>
             <w:r>
-              <w:t>SRD-005</w:t>
+              <w:t>SRD-007</w:t>
             </w:r>
           </w:p>
         </w:tc>
@@ -13914,7 +13962,7 @@
             <w:proofErr w:type="spellStart"/>
             <w:proofErr w:type="gramStart"/>
             <w:r>
-              <w:t>MapEngine</w:t>
+              <w:t>MainWindow</w:t>
             </w:r>
             <w:proofErr w:type="spellEnd"/>
             <w:r>
@@ -13922,7 +13970,7 @@
             </w:r>
             <w:proofErr w:type="spellStart"/>
             <w:r>
-              <w:t>removeLastWaypoint</w:t>
+              <w:t>updateStatus</w:t>
             </w:r>
             <w:proofErr w:type="spellEnd"/>
             <w:r>
@@ -13930,7 +13978,15 @@
             </w:r>
             <w:proofErr w:type="gramEnd"/>
             <w:r>
-              <w:t>) [SDD-024]</w:t>
+              <w:t>) [SDD-</w:t>
+            </w:r>
+            <w:proofErr w:type="gramStart"/>
+            <w:r>
+              <w:t>051..</w:t>
+            </w:r>
+            <w:proofErr w:type="gramEnd"/>
+            <w:r>
+              <w:t>054]</w:t>
             </w:r>
           </w:p>
         </w:tc>
@@ -13944,7 +14000,7 @@
               <w:pStyle w:val="CellBody"/>
             </w:pPr>
             <w:r>
-              <w:t>TEST-024</w:t>
+              <w:t>GUI</w:t>
             </w:r>
           </w:p>
         </w:tc>
@@ -13960,7 +14016,64 @@
               <w:pStyle w:val="CellBody"/>
             </w:pPr>
             <w:r>
-              <w:t>SRD-006</w:t>
+              <w:t>SRD-010</w:t>
+            </w:r>
+          </w:p>
+        </w:tc>
+        <w:tc>
+          <w:tcPr>
+            <w:tcW w:w="2270" w:type="pct"/>
+            <w:vAlign w:val="bottom"/>
+          </w:tcPr>
+          <w:p>
+            <w:pPr>
+              <w:pStyle w:val="CellBody"/>
+            </w:pPr>
+            <w:proofErr w:type="gramStart"/>
+            <w:r>
+              <w:t>Waypoint</w:t>
+            </w:r>
+            <w:proofErr w:type="gramEnd"/>
+            <w:r>
+              <w:t xml:space="preserve"> </w:t>
+            </w:r>
+            <w:proofErr w:type="gramStart"/>
+            <w:r>
+              <w:t>struct</w:t>
+            </w:r>
+            <w:proofErr w:type="gramEnd"/>
+            <w:r>
+              <w:t xml:space="preserve"> [SDD-001]</w:t>
+            </w:r>
+          </w:p>
+        </w:tc>
+        <w:tc>
+          <w:tcPr>
+            <w:tcW w:w="1868" w:type="pct"/>
+            <w:vAlign w:val="bottom"/>
+          </w:tcPr>
+          <w:p>
+            <w:pPr>
+              <w:pStyle w:val="CellBody"/>
+            </w:pPr>
+            <w:r>
+              <w:t>TEST-023</w:t>
+            </w:r>
+          </w:p>
+        </w:tc>
+      </w:tr>
+      <w:tr>
+        <w:tc>
+          <w:tcPr>
+            <w:tcW w:w="862" w:type="pct"/>
+            <w:vAlign w:val="bottom"/>
+          </w:tcPr>
+          <w:p>
+            <w:pPr>
+              <w:pStyle w:val="CellBody"/>
+            </w:pPr>
+            <w:r>
+              <w:t>SRD-011</w:t>
             </w:r>
           </w:p>
         </w:tc>
@@ -13976,7 +14089,7 @@
             <w:proofErr w:type="spellStart"/>
             <w:proofErr w:type="gramStart"/>
             <w:r>
-              <w:t>MapEngine</w:t>
+              <w:t>MissionManager</w:t>
             </w:r>
             <w:proofErr w:type="spellEnd"/>
             <w:r>
@@ -13984,7 +14097,7 @@
             </w:r>
             <w:proofErr w:type="spellStart"/>
             <w:r>
-              <w:t>clearAll</w:t>
+              <w:t>buildTrajectory</w:t>
             </w:r>
             <w:proofErr w:type="spellEnd"/>
             <w:r>
@@ -13992,8 +14105,49 @@
             </w:r>
             <w:proofErr w:type="gramEnd"/>
             <w:r>
-              <w:t xml:space="preserve">) [SDD-025], </w:t>
-            </w:r>
+              <w:t>) [SDD-012]</w:t>
+            </w:r>
+          </w:p>
+        </w:tc>
+        <w:tc>
+          <w:tcPr>
+            <w:tcW w:w="1868" w:type="pct"/>
+            <w:vAlign w:val="bottom"/>
+          </w:tcPr>
+          <w:p>
+            <w:pPr>
+              <w:pStyle w:val="CellBody"/>
+            </w:pPr>
+            <w:r>
+              <w:t>TEST-014, TEST-017</w:t>
+            </w:r>
+          </w:p>
+        </w:tc>
+      </w:tr>
+      <w:tr>
+        <w:tc>
+          <w:tcPr>
+            <w:tcW w:w="862" w:type="pct"/>
+            <w:vAlign w:val="bottom"/>
+          </w:tcPr>
+          <w:p>
+            <w:pPr>
+              <w:pStyle w:val="CellBody"/>
+            </w:pPr>
+            <w:r>
+              <w:t>SRD-012</w:t>
+            </w:r>
+          </w:p>
+        </w:tc>
+        <w:tc>
+          <w:tcPr>
+            <w:tcW w:w="2270" w:type="pct"/>
+            <w:vAlign w:val="bottom"/>
+          </w:tcPr>
+          <w:p>
+            <w:pPr>
+              <w:pStyle w:val="CellBody"/>
+            </w:pPr>
             <w:proofErr w:type="spellStart"/>
             <w:proofErr w:type="gramStart"/>
             <w:r>
@@ -14001,11 +14155,19 @@
             </w:r>
             <w:proofErr w:type="spellEnd"/>
             <w:r>
-              <w:t>::clear(</w:t>
+              <w:t>::</w:t>
+            </w:r>
+            <w:proofErr w:type="spellStart"/>
+            <w:r>
+              <w:t>buildTrajectory</w:t>
+            </w:r>
+            <w:proofErr w:type="spellEnd"/>
+            <w:r>
+              <w:t>(</w:t>
             </w:r>
             <w:proofErr w:type="gramEnd"/>
             <w:r>
-              <w:t>)</w:t>
+              <w:t>) [SDD-013]</w:t>
             </w:r>
           </w:p>
         </w:tc>
@@ -14019,7 +14181,7 @@
               <w:pStyle w:val="CellBody"/>
             </w:pPr>
             <w:r>
-              <w:t>TEST-025</w:t>
+              <w:t>TEST-015, TEST-018</w:t>
             </w:r>
           </w:p>
         </w:tc>
@@ -14035,7 +14197,64 @@
               <w:pStyle w:val="CellBody"/>
             </w:pPr>
             <w:r>
-              <w:t>SRD-007</w:t>
+              <w:t>SRD-013</w:t>
+            </w:r>
+          </w:p>
+        </w:tc>
+        <w:tc>
+          <w:tcPr>
+            <w:tcW w:w="2270" w:type="pct"/>
+            <w:vAlign w:val="bottom"/>
+          </w:tcPr>
+          <w:p>
+            <w:pPr>
+              <w:pStyle w:val="CellBody"/>
+            </w:pPr>
+            <w:proofErr w:type="gramStart"/>
+            <w:r>
+              <w:t>Waypoint::</w:t>
+            </w:r>
+            <w:proofErr w:type="spellStart"/>
+            <w:r>
+              <w:t>defaultAltitude</w:t>
+            </w:r>
+            <w:proofErr w:type="spellEnd"/>
+            <w:r>
+              <w:t>(</w:t>
+            </w:r>
+            <w:proofErr w:type="gramEnd"/>
+            <w:r>
+              <w:t>) [SDD-003]</w:t>
+            </w:r>
+          </w:p>
+        </w:tc>
+        <w:tc>
+          <w:tcPr>
+            <w:tcW w:w="1868" w:type="pct"/>
+            <w:vAlign w:val="bottom"/>
+          </w:tcPr>
+          <w:p>
+            <w:pPr>
+              <w:pStyle w:val="CellBody"/>
+            </w:pPr>
+            <w:r>
+              <w:t>TEST-012, TEST-019</w:t>
+            </w:r>
+          </w:p>
+        </w:tc>
+      </w:tr>
+      <w:tr>
+        <w:tc>
+          <w:tcPr>
+            <w:tcW w:w="862" w:type="pct"/>
+            <w:vAlign w:val="bottom"/>
+          </w:tcPr>
+          <w:p>
+            <w:pPr>
+              <w:pStyle w:val="CellBody"/>
+            </w:pPr>
+            <w:r>
+              <w:t>SRD-014</w:t>
             </w:r>
           </w:p>
         </w:tc>
@@ -14051,7 +14270,7 @@
             <w:proofErr w:type="spellStart"/>
             <w:proofErr w:type="gramStart"/>
             <w:r>
-              <w:t>MainWindow</w:t>
+              <w:t>MissionManager</w:t>
             </w:r>
             <w:proofErr w:type="spellEnd"/>
             <w:r>
@@ -14059,7 +14278,7 @@
             </w:r>
             <w:proofErr w:type="spellStart"/>
             <w:r>
-              <w:t>updateStatus</w:t>
+              <w:t>isValid</w:t>
             </w:r>
             <w:proofErr w:type="spellEnd"/>
             <w:r>
@@ -14067,15 +14286,7 @@
             </w:r>
             <w:proofErr w:type="gramEnd"/>
             <w:r>
-              <w:t>) [SDD-</w:t>
-            </w:r>
-            <w:proofErr w:type="gramStart"/>
-            <w:r>
-              <w:t>051..</w:t>
-            </w:r>
-            <w:proofErr w:type="gramEnd"/>
-            <w:r>
-              <w:t>054]</w:t>
+              <w:t>) [SDD-010]</w:t>
             </w:r>
           </w:p>
         </w:tc>
@@ -14089,7 +14300,7 @@
               <w:pStyle w:val="CellBody"/>
             </w:pPr>
             <w:r>
-              <w:t>GUI</w:t>
+              <w:t>TEST-001, TEST-002, TEST-003</w:t>
             </w:r>
           </w:p>
         </w:tc>
@@ -14105,7 +14316,7 @@
               <w:pStyle w:val="CellBody"/>
             </w:pPr>
             <w:r>
-              <w:t>SRD-010</w:t>
+              <w:t>SRD-015</w:t>
             </w:r>
           </w:p>
         </w:tc>
@@ -14118,21 +14329,26 @@
             <w:pPr>
               <w:pStyle w:val="CellBody"/>
             </w:pPr>
+            <w:proofErr w:type="spellStart"/>
             <w:proofErr w:type="gramStart"/>
             <w:r>
-              <w:t>Waypoint</w:t>
+              <w:t>MissionManager</w:t>
+            </w:r>
+            <w:proofErr w:type="spellEnd"/>
+            <w:r>
+              <w:t>::</w:t>
+            </w:r>
+            <w:proofErr w:type="spellStart"/>
+            <w:r>
+              <w:t>isValid</w:t>
+            </w:r>
+            <w:proofErr w:type="spellEnd"/>
+            <w:r>
+              <w:t>(</w:t>
             </w:r>
             <w:proofErr w:type="gramEnd"/>
             <w:r>
-              <w:t xml:space="preserve"> </w:t>
-            </w:r>
-            <w:proofErr w:type="gramStart"/>
-            <w:r>
-              <w:t>struct</w:t>
-            </w:r>
-            <w:proofErr w:type="gramEnd"/>
-            <w:r>
-              <w:t xml:space="preserve"> [SDD-001]</w:t>
+              <w:t>) [SDD-011]</w:t>
             </w:r>
           </w:p>
         </w:tc>
@@ -14146,7 +14362,7 @@
               <w:pStyle w:val="CellBody"/>
             </w:pPr>
             <w:r>
-              <w:t>TEST-023</w:t>
+              <w:t>TEST-004, TEST-005, TEST-008, TEST-011</w:t>
             </w:r>
           </w:p>
         </w:tc>
@@ -14162,7 +14378,7 @@
               <w:pStyle w:val="CellBody"/>
             </w:pPr>
             <w:r>
-              <w:t>SRD-011</w:t>
+              <w:t>SRD-020</w:t>
             </w:r>
           </w:p>
         </w:tc>
@@ -14178,7 +14394,7 @@
             <w:proofErr w:type="spellStart"/>
             <w:proofErr w:type="gramStart"/>
             <w:r>
-              <w:t>MissionManager</w:t>
+              <w:t>MainWindow</w:t>
             </w:r>
             <w:proofErr w:type="spellEnd"/>
             <w:r>
@@ -14186,7 +14402,7 @@
             </w:r>
             <w:proofErr w:type="spellStart"/>
             <w:r>
-              <w:t>buildTrajectory</w:t>
+              <w:t>onUpload</w:t>
             </w:r>
             <w:proofErr w:type="spellEnd"/>
             <w:r>
@@ -14194,7 +14410,7 @@
             </w:r>
             <w:proofErr w:type="gramEnd"/>
             <w:r>
-              <w:t>) [SDD-012]</w:t>
+              <w:t>) [SDD-030, SDD-032]</w:t>
             </w:r>
           </w:p>
         </w:tc>
@@ -14208,7 +14424,7 @@
               <w:pStyle w:val="CellBody"/>
             </w:pPr>
             <w:r>
-              <w:t>TEST-014, TEST-017</w:t>
+              <w:t>GUI</w:t>
             </w:r>
           </w:p>
         </w:tc>
@@ -14224,7 +14440,7 @@
               <w:pStyle w:val="CellBody"/>
             </w:pPr>
             <w:r>
-              <w:t>SRD-012</w:t>
+              <w:t>SRD-021</w:t>
             </w:r>
           </w:p>
         </w:tc>
@@ -14240,7 +14456,7 @@
             <w:proofErr w:type="spellStart"/>
             <w:proofErr w:type="gramStart"/>
             <w:r>
-              <w:t>MissionManager</w:t>
+              <w:t>MainWindow</w:t>
             </w:r>
             <w:proofErr w:type="spellEnd"/>
             <w:r>
@@ -14248,7 +14464,7 @@
             </w:r>
             <w:proofErr w:type="spellStart"/>
             <w:r>
-              <w:t>buildTrajectory</w:t>
+              <w:t>onUpload</w:t>
             </w:r>
             <w:proofErr w:type="spellEnd"/>
             <w:r>
@@ -14256,7 +14472,7 @@
             </w:r>
             <w:proofErr w:type="gramEnd"/>
             <w:r>
-              <w:t>) [SDD-013]</w:t>
+              <w:t>) [SDD-031]</w:t>
             </w:r>
           </w:p>
         </w:tc>
@@ -14270,7 +14486,10 @@
               <w:pStyle w:val="CellBody"/>
             </w:pPr>
             <w:r>
-              <w:t>TEST-015, TEST-018</w:t>
+              <w:t>TEST-020 to TEST-022</w:t>
+            </w:r>
+            <w:r>
+              <w:t>, GUI</w:t>
             </w:r>
           </w:p>
         </w:tc>
@@ -14286,7 +14505,7 @@
               <w:pStyle w:val="CellBody"/>
             </w:pPr>
             <w:r>
-              <w:t>SRD-013</w:t>
+              <w:t>SRD-022</w:t>
             </w:r>
           </w:p>
         </w:tc>
@@ -14299,13 +14518,18 @@
             <w:pPr>
               <w:pStyle w:val="CellBody"/>
             </w:pPr>
+            <w:proofErr w:type="spellStart"/>
             <w:proofErr w:type="gramStart"/>
             <w:r>
-              <w:t>Waypoint::</w:t>
+              <w:t>MissionManager</w:t>
+            </w:r>
+            <w:proofErr w:type="spellEnd"/>
+            <w:r>
+              <w:t>::</w:t>
             </w:r>
             <w:proofErr w:type="spellStart"/>
             <w:r>
-              <w:t>defaultAltitude</w:t>
+              <w:t>buildTrajectory</w:t>
             </w:r>
             <w:proofErr w:type="spellEnd"/>
             <w:r>
@@ -14313,7 +14537,7 @@
             </w:r>
             <w:proofErr w:type="gramEnd"/>
             <w:r>
-              <w:t>) [SDD-003]</w:t>
+              <w:t>) [SDD-014]</w:t>
             </w:r>
           </w:p>
         </w:tc>
@@ -14327,7 +14551,7 @@
               <w:pStyle w:val="CellBody"/>
             </w:pPr>
             <w:r>
-              <w:t>TEST-012, TEST-019</w:t>
+              <w:t>TEST-016</w:t>
             </w:r>
           </w:p>
         </w:tc>
@@ -14343,7 +14567,316 @@
               <w:pStyle w:val="CellBody"/>
             </w:pPr>
             <w:r>
-              <w:t>SRD-014</w:t>
+              <w:t>SDD-001</w:t>
+            </w:r>
+          </w:p>
+        </w:tc>
+        <w:tc>
+          <w:tcPr>
+            <w:tcW w:w="2270" w:type="pct"/>
+            <w:vAlign w:val="bottom"/>
+          </w:tcPr>
+          <w:p>
+            <w:pPr>
+              <w:pStyle w:val="CellBody"/>
+            </w:pPr>
+            <w:proofErr w:type="spellStart"/>
+            <w:r>
+              <w:t>Waypoint.h</w:t>
+            </w:r>
+            <w:proofErr w:type="spellEnd"/>
+            <w:r>
+              <w:t>: struct Waypoint</w:t>
+            </w:r>
+          </w:p>
+        </w:tc>
+        <w:tc>
+          <w:tcPr>
+            <w:tcW w:w="1868" w:type="pct"/>
+            <w:vAlign w:val="bottom"/>
+          </w:tcPr>
+          <w:p>
+            <w:pPr>
+              <w:pStyle w:val="CellBody"/>
+            </w:pPr>
+            <w:r>
+              <w:t>TEST-012, TEST-013</w:t>
+            </w:r>
+          </w:p>
+        </w:tc>
+      </w:tr>
+      <w:tr>
+        <w:tc>
+          <w:tcPr>
+            <w:tcW w:w="862" w:type="pct"/>
+            <w:vAlign w:val="bottom"/>
+          </w:tcPr>
+          <w:p>
+            <w:pPr>
+              <w:pStyle w:val="CellBody"/>
+            </w:pPr>
+            <w:r>
+              <w:t>SDD-002</w:t>
+            </w:r>
+          </w:p>
+        </w:tc>
+        <w:tc>
+          <w:tcPr>
+            <w:tcW w:w="2270" w:type="pct"/>
+            <w:vAlign w:val="bottom"/>
+          </w:tcPr>
+          <w:p>
+            <w:pPr>
+              <w:pStyle w:val="CellBody"/>
+            </w:pPr>
+            <w:proofErr w:type="spellStart"/>
+            <w:r>
+              <w:t>Waypoint.h</w:t>
+            </w:r>
+            <w:proofErr w:type="spellEnd"/>
+            <w:r>
+              <w:t xml:space="preserve">: </w:t>
+            </w:r>
+            <w:proofErr w:type="spellStart"/>
+            <w:r>
+              <w:t>enum</w:t>
+            </w:r>
+            <w:proofErr w:type="spellEnd"/>
+            <w:r>
+              <w:t xml:space="preserve"> class </w:t>
+            </w:r>
+            <w:proofErr w:type="spellStart"/>
+            <w:r>
+              <w:t>WaypointType</w:t>
+            </w:r>
+            <w:proofErr w:type="spellEnd"/>
+          </w:p>
+        </w:tc>
+        <w:tc>
+          <w:tcPr>
+            <w:tcW w:w="1868" w:type="pct"/>
+            <w:vAlign w:val="bottom"/>
+          </w:tcPr>
+          <w:p>
+            <w:pPr>
+              <w:pStyle w:val="CellBody"/>
+            </w:pPr>
+            <w:r>
+              <w:t>TEST-012 to TEST-019</w:t>
+            </w:r>
+          </w:p>
+        </w:tc>
+      </w:tr>
+      <w:tr>
+        <w:tc>
+          <w:tcPr>
+            <w:tcW w:w="862" w:type="pct"/>
+            <w:vAlign w:val="bottom"/>
+          </w:tcPr>
+          <w:p>
+            <w:pPr>
+              <w:pStyle w:val="CellBody"/>
+            </w:pPr>
+            <w:r>
+              <w:t>SDD-003</w:t>
+            </w:r>
+          </w:p>
+        </w:tc>
+        <w:tc>
+          <w:tcPr>
+            <w:tcW w:w="2270" w:type="pct"/>
+            <w:vAlign w:val="bottom"/>
+          </w:tcPr>
+          <w:p>
+            <w:pPr>
+              <w:pStyle w:val="CellBody"/>
+            </w:pPr>
+            <w:proofErr w:type="gramStart"/>
+            <w:r>
+              <w:t>Waypoint::</w:t>
+            </w:r>
+            <w:proofErr w:type="spellStart"/>
+            <w:r>
+              <w:t>defaultAltitude</w:t>
+            </w:r>
+            <w:proofErr w:type="spellEnd"/>
+            <w:r>
+              <w:t>(</w:t>
+            </w:r>
+            <w:proofErr w:type="gramEnd"/>
+            <w:r>
+              <w:t>)</w:t>
+            </w:r>
+          </w:p>
+        </w:tc>
+        <w:tc>
+          <w:tcPr>
+            <w:tcW w:w="1868" w:type="pct"/>
+            <w:vAlign w:val="bottom"/>
+          </w:tcPr>
+          <w:p>
+            <w:pPr>
+              <w:pStyle w:val="CellBody"/>
+            </w:pPr>
+            <w:r>
+              <w:t>TEST-012</w:t>
+            </w:r>
+            <w:r>
+              <w:t xml:space="preserve">, </w:t>
+            </w:r>
+            <w:r>
+              <w:t>TEST-01</w:t>
+            </w:r>
+            <w:r>
+              <w:t>4</w:t>
+            </w:r>
+          </w:p>
+        </w:tc>
+      </w:tr>
+      <w:tr>
+        <w:tc>
+          <w:tcPr>
+            <w:tcW w:w="862" w:type="pct"/>
+            <w:vAlign w:val="bottom"/>
+          </w:tcPr>
+          <w:p>
+            <w:pPr>
+              <w:pStyle w:val="CellBody"/>
+            </w:pPr>
+            <w:r>
+              <w:t>SDD-004</w:t>
+            </w:r>
+          </w:p>
+        </w:tc>
+        <w:tc>
+          <w:tcPr>
+            <w:tcW w:w="2270" w:type="pct"/>
+            <w:vAlign w:val="bottom"/>
+          </w:tcPr>
+          <w:p>
+            <w:pPr>
+              <w:pStyle w:val="CellBody"/>
+            </w:pPr>
+            <w:proofErr w:type="gramStart"/>
+            <w:r>
+              <w:t>Waypoint::</w:t>
+            </w:r>
+            <w:proofErr w:type="spellStart"/>
+            <w:r>
+              <w:t>defaultAltitude</w:t>
+            </w:r>
+            <w:proofErr w:type="spellEnd"/>
+            <w:r>
+              <w:t>(</w:t>
+            </w:r>
+            <w:proofErr w:type="gramEnd"/>
+            <w:r>
+              <w:t>)</w:t>
+            </w:r>
+          </w:p>
+        </w:tc>
+        <w:tc>
+          <w:tcPr>
+            <w:tcW w:w="1868" w:type="pct"/>
+            <w:vAlign w:val="bottom"/>
+          </w:tcPr>
+          <w:p>
+            <w:pPr>
+              <w:pStyle w:val="CellBody"/>
+            </w:pPr>
+            <w:r>
+              <w:t>TEST-01</w:t>
+            </w:r>
+            <w:r>
+              <w:t>3</w:t>
+            </w:r>
+            <w:r>
+              <w:t>, TEST-01</w:t>
+            </w:r>
+            <w:r>
+              <w:t>7</w:t>
+            </w:r>
+          </w:p>
+        </w:tc>
+      </w:tr>
+      <w:tr>
+        <w:tc>
+          <w:tcPr>
+            <w:tcW w:w="862" w:type="pct"/>
+            <w:vAlign w:val="bottom"/>
+          </w:tcPr>
+          <w:p>
+            <w:pPr>
+              <w:pStyle w:val="CellBody"/>
+            </w:pPr>
+            <w:r>
+              <w:t>SDD-005</w:t>
+            </w:r>
+          </w:p>
+        </w:tc>
+        <w:tc>
+          <w:tcPr>
+            <w:tcW w:w="2270" w:type="pct"/>
+            <w:vAlign w:val="bottom"/>
+          </w:tcPr>
+          <w:p>
+            <w:pPr>
+              <w:pStyle w:val="CellBody"/>
+            </w:pPr>
+            <w:proofErr w:type="gramStart"/>
+            <w:r>
+              <w:t>Waypoint::</w:t>
+            </w:r>
+            <w:proofErr w:type="spellStart"/>
+            <w:r>
+              <w:t>defaultAltitude</w:t>
+            </w:r>
+            <w:proofErr w:type="spellEnd"/>
+            <w:r>
+              <w:t>(</w:t>
+            </w:r>
+            <w:proofErr w:type="gramEnd"/>
+            <w:r>
+              <w:t>)</w:t>
+            </w:r>
+          </w:p>
+        </w:tc>
+        <w:tc>
+          <w:tcPr>
+            <w:tcW w:w="1868" w:type="pct"/>
+            <w:vAlign w:val="bottom"/>
+          </w:tcPr>
+          <w:p>
+            <w:pPr>
+              <w:pStyle w:val="CellBody"/>
+            </w:pPr>
+            <w:r>
+              <w:t>TEST-01</w:t>
+            </w:r>
+            <w:r>
+              <w:t>3</w:t>
+            </w:r>
+            <w:r>
+              <w:t>, TEST-01</w:t>
+            </w:r>
+            <w:r>
+              <w:t>8</w:t>
+            </w:r>
+          </w:p>
+        </w:tc>
+      </w:tr>
+      <w:tr>
+        <w:tc>
+          <w:tcPr>
+            <w:tcW w:w="862" w:type="pct"/>
+            <w:vAlign w:val="bottom"/>
+          </w:tcPr>
+          <w:p>
+            <w:pPr>
+              <w:pStyle w:val="CellBody"/>
+            </w:pPr>
+            <w:r>
+              <w:t>SDD-010</w:t>
             </w:r>
           </w:p>
         </w:tc>
@@ -14375,7 +14908,7 @@
             </w:r>
             <w:proofErr w:type="gramEnd"/>
             <w:r>
-              <w:t>) [SDD-010]</w:t>
+              <w:t>)</w:t>
             </w:r>
           </w:p>
         </w:tc>
@@ -14389,7 +14922,7 @@
               <w:pStyle w:val="CellBody"/>
             </w:pPr>
             <w:r>
-              <w:t>TEST-003 to TEST-011, TEST-020 to TEST-022</w:t>
+              <w:t>TEST-001, TEST-002, TEST-003</w:t>
             </w:r>
           </w:p>
         </w:tc>
@@ -14405,599 +14938,7 @@
               <w:pStyle w:val="CellBody"/>
             </w:pPr>
             <w:r>
-              <w:t>SRD-015</w:t>
-            </w:r>
-          </w:p>
-        </w:tc>
-        <w:tc>
-          <w:tcPr>
-            <w:tcW w:w="2270" w:type="pct"/>
-            <w:vAlign w:val="bottom"/>
-          </w:tcPr>
-          <w:p>
-            <w:pPr>
-              <w:pStyle w:val="CellBody"/>
-            </w:pPr>
-            <w:proofErr w:type="spellStart"/>
-            <w:proofErr w:type="gramStart"/>
-            <w:r>
-              <w:t>MissionManager</w:t>
-            </w:r>
-            <w:proofErr w:type="spellEnd"/>
-            <w:r>
-              <w:t>::</w:t>
-            </w:r>
-            <w:proofErr w:type="spellStart"/>
-            <w:r>
-              <w:t>isValid</w:t>
-            </w:r>
-            <w:proofErr w:type="spellEnd"/>
-            <w:r>
-              <w:t>(</w:t>
-            </w:r>
-            <w:proofErr w:type="gramEnd"/>
-            <w:r>
-              <w:t>) [SDD-011]</w:t>
-            </w:r>
-          </w:p>
-        </w:tc>
-        <w:tc>
-          <w:tcPr>
-            <w:tcW w:w="1868" w:type="pct"/>
-            <w:vAlign w:val="bottom"/>
-          </w:tcPr>
-          <w:p>
-            <w:pPr>
-              <w:pStyle w:val="CellBody"/>
-            </w:pPr>
-            <w:r>
-              <w:t>TEST-004, TEST-005, TEST-008, TEST-011</w:t>
-            </w:r>
-          </w:p>
-        </w:tc>
-      </w:tr>
-      <w:tr>
-        <w:tc>
-          <w:tcPr>
-            <w:tcW w:w="862" w:type="pct"/>
-            <w:vAlign w:val="bottom"/>
-          </w:tcPr>
-          <w:p>
-            <w:pPr>
-              <w:pStyle w:val="CellBody"/>
-            </w:pPr>
-            <w:r>
-              <w:t>SRD-020</w:t>
-            </w:r>
-          </w:p>
-        </w:tc>
-        <w:tc>
-          <w:tcPr>
-            <w:tcW w:w="2270" w:type="pct"/>
-            <w:vAlign w:val="bottom"/>
-          </w:tcPr>
-          <w:p>
-            <w:pPr>
-              <w:pStyle w:val="CellBody"/>
-            </w:pPr>
-            <w:proofErr w:type="spellStart"/>
-            <w:proofErr w:type="gramStart"/>
-            <w:r>
-              <w:t>MainWindow</w:t>
-            </w:r>
-            <w:proofErr w:type="spellEnd"/>
-            <w:r>
-              <w:t>::</w:t>
-            </w:r>
-            <w:proofErr w:type="spellStart"/>
-            <w:r>
-              <w:t>onUpload</w:t>
-            </w:r>
-            <w:proofErr w:type="spellEnd"/>
-            <w:r>
-              <w:t>(</w:t>
-            </w:r>
-            <w:proofErr w:type="gramEnd"/>
-            <w:r>
-              <w:t>) [SDD-030, SDD-032]</w:t>
-            </w:r>
-          </w:p>
-        </w:tc>
-        <w:tc>
-          <w:tcPr>
-            <w:tcW w:w="1868" w:type="pct"/>
-            <w:vAlign w:val="bottom"/>
-          </w:tcPr>
-          <w:p>
-            <w:pPr>
-              <w:pStyle w:val="CellBody"/>
-            </w:pPr>
-            <w:r>
-              <w:t>GUI</w:t>
-            </w:r>
-          </w:p>
-        </w:tc>
-      </w:tr>
-      <w:tr>
-        <w:tc>
-          <w:tcPr>
-            <w:tcW w:w="862" w:type="pct"/>
-            <w:vAlign w:val="bottom"/>
-          </w:tcPr>
-          <w:p>
-            <w:pPr>
-              <w:pStyle w:val="CellBody"/>
-            </w:pPr>
-            <w:r>
-              <w:t>SRD-021</w:t>
-            </w:r>
-          </w:p>
-        </w:tc>
-        <w:tc>
-          <w:tcPr>
-            <w:tcW w:w="2270" w:type="pct"/>
-            <w:vAlign w:val="bottom"/>
-          </w:tcPr>
-          <w:p>
-            <w:pPr>
-              <w:pStyle w:val="CellBody"/>
-            </w:pPr>
-            <w:proofErr w:type="spellStart"/>
-            <w:proofErr w:type="gramStart"/>
-            <w:r>
-              <w:t>MainWindow</w:t>
-            </w:r>
-            <w:proofErr w:type="spellEnd"/>
-            <w:r>
-              <w:t>::</w:t>
-            </w:r>
-            <w:proofErr w:type="spellStart"/>
-            <w:r>
-              <w:t>onUpload</w:t>
-            </w:r>
-            <w:proofErr w:type="spellEnd"/>
-            <w:r>
-              <w:t>(</w:t>
-            </w:r>
-            <w:proofErr w:type="gramEnd"/>
-            <w:r>
-              <w:t>) [SDD-031]</w:t>
-            </w:r>
-          </w:p>
-        </w:tc>
-        <w:tc>
-          <w:tcPr>
-            <w:tcW w:w="1868" w:type="pct"/>
-            <w:vAlign w:val="bottom"/>
-          </w:tcPr>
-          <w:p>
-            <w:pPr>
-              <w:pStyle w:val="CellBody"/>
-            </w:pPr>
-            <w:r>
-              <w:t>TEST-020 to TEST-022</w:t>
-            </w:r>
-          </w:p>
-        </w:tc>
-      </w:tr>
-      <w:tr>
-        <w:tc>
-          <w:tcPr>
-            <w:tcW w:w="862" w:type="pct"/>
-            <w:vAlign w:val="bottom"/>
-          </w:tcPr>
-          <w:p>
-            <w:pPr>
-              <w:pStyle w:val="CellBody"/>
-            </w:pPr>
-            <w:r>
-              <w:t>SRD-022</w:t>
-            </w:r>
-          </w:p>
-        </w:tc>
-        <w:tc>
-          <w:tcPr>
-            <w:tcW w:w="2270" w:type="pct"/>
-            <w:vAlign w:val="bottom"/>
-          </w:tcPr>
-          <w:p>
-            <w:pPr>
-              <w:pStyle w:val="CellBody"/>
-            </w:pPr>
-            <w:proofErr w:type="spellStart"/>
-            <w:proofErr w:type="gramStart"/>
-            <w:r>
-              <w:t>MissionManager</w:t>
-            </w:r>
-            <w:proofErr w:type="spellEnd"/>
-            <w:r>
-              <w:t>::</w:t>
-            </w:r>
-            <w:proofErr w:type="spellStart"/>
-            <w:r>
-              <w:t>buildTrajectory</w:t>
-            </w:r>
-            <w:proofErr w:type="spellEnd"/>
-            <w:r>
-              <w:t>(</w:t>
-            </w:r>
-            <w:proofErr w:type="gramEnd"/>
-            <w:r>
-              <w:t>) [SDD-014]</w:t>
-            </w:r>
-          </w:p>
-        </w:tc>
-        <w:tc>
-          <w:tcPr>
-            <w:tcW w:w="1868" w:type="pct"/>
-            <w:vAlign w:val="bottom"/>
-          </w:tcPr>
-          <w:p>
-            <w:pPr>
-              <w:pStyle w:val="CellBody"/>
-            </w:pPr>
-            <w:r>
-              <w:t>TEST-016</w:t>
-            </w:r>
-          </w:p>
-        </w:tc>
-      </w:tr>
-      <w:tr>
-        <w:tc>
-          <w:tcPr>
-            <w:tcW w:w="862" w:type="pct"/>
-            <w:vAlign w:val="bottom"/>
-          </w:tcPr>
-          <w:p>
-            <w:pPr>
-              <w:pStyle w:val="CellBody"/>
-            </w:pPr>
-            <w:r>
-              <w:t>SDD-001</w:t>
-            </w:r>
-          </w:p>
-        </w:tc>
-        <w:tc>
-          <w:tcPr>
-            <w:tcW w:w="2270" w:type="pct"/>
-            <w:vAlign w:val="bottom"/>
-          </w:tcPr>
-          <w:p>
-            <w:pPr>
-              <w:pStyle w:val="CellBody"/>
-            </w:pPr>
-            <w:proofErr w:type="spellStart"/>
-            <w:r>
-              <w:t>Waypoint.h</w:t>
-            </w:r>
-            <w:proofErr w:type="spellEnd"/>
-            <w:r>
-              <w:t>: struct Waypoint</w:t>
-            </w:r>
-          </w:p>
-        </w:tc>
-        <w:tc>
-          <w:tcPr>
-            <w:tcW w:w="1868" w:type="pct"/>
-            <w:vAlign w:val="bottom"/>
-          </w:tcPr>
-          <w:p>
-            <w:pPr>
-              <w:pStyle w:val="CellBody"/>
-            </w:pPr>
-            <w:r>
-              <w:t>TEST-012, TEST-013</w:t>
-            </w:r>
-          </w:p>
-        </w:tc>
-      </w:tr>
-      <w:tr>
-        <w:tc>
-          <w:tcPr>
-            <w:tcW w:w="862" w:type="pct"/>
-            <w:vAlign w:val="bottom"/>
-          </w:tcPr>
-          <w:p>
-            <w:pPr>
-              <w:pStyle w:val="CellBody"/>
-            </w:pPr>
-            <w:r>
-              <w:t>SDD-002</w:t>
-            </w:r>
-          </w:p>
-        </w:tc>
-        <w:tc>
-          <w:tcPr>
-            <w:tcW w:w="2270" w:type="pct"/>
-            <w:vAlign w:val="bottom"/>
-          </w:tcPr>
-          <w:p>
-            <w:pPr>
-              <w:pStyle w:val="CellBody"/>
-            </w:pPr>
-            <w:proofErr w:type="spellStart"/>
-            <w:r>
-              <w:t>Waypoint.h</w:t>
-            </w:r>
-            <w:proofErr w:type="spellEnd"/>
-            <w:r>
-              <w:t xml:space="preserve">: </w:t>
-            </w:r>
-            <w:proofErr w:type="spellStart"/>
-            <w:r>
-              <w:t>enum</w:t>
-            </w:r>
-            <w:proofErr w:type="spellEnd"/>
-            <w:r>
-              <w:t xml:space="preserve"> class </w:t>
-            </w:r>
-            <w:proofErr w:type="spellStart"/>
-            <w:r>
-              <w:t>WaypointType</w:t>
-            </w:r>
-            <w:proofErr w:type="spellEnd"/>
-          </w:p>
-        </w:tc>
-        <w:tc>
-          <w:tcPr>
-            <w:tcW w:w="1868" w:type="pct"/>
-            <w:vAlign w:val="bottom"/>
-          </w:tcPr>
-          <w:p>
-            <w:pPr>
-              <w:pStyle w:val="CellBody"/>
-            </w:pPr>
-            <w:r>
-              <w:t>TEST-012 to TEST-019</w:t>
-            </w:r>
-          </w:p>
-        </w:tc>
-      </w:tr>
-      <w:tr>
-        <w:tc>
-          <w:tcPr>
-            <w:tcW w:w="862" w:type="pct"/>
-            <w:vAlign w:val="bottom"/>
-          </w:tcPr>
-          <w:p>
-            <w:pPr>
-              <w:pStyle w:val="CellBody"/>
-            </w:pPr>
-            <w:r>
-              <w:t>SDD-003</w:t>
-            </w:r>
-          </w:p>
-        </w:tc>
-        <w:tc>
-          <w:tcPr>
-            <w:tcW w:w="2270" w:type="pct"/>
-            <w:vAlign w:val="bottom"/>
-          </w:tcPr>
-          <w:p>
-            <w:pPr>
-              <w:pStyle w:val="CellBody"/>
-            </w:pPr>
-            <w:proofErr w:type="gramStart"/>
-            <w:r>
-              <w:t>Waypoint::</w:t>
-            </w:r>
-            <w:proofErr w:type="spellStart"/>
-            <w:r>
-              <w:t>defaultAltitude</w:t>
-            </w:r>
-            <w:proofErr w:type="spellEnd"/>
-            <w:r>
-              <w:t>(</w:t>
-            </w:r>
-            <w:proofErr w:type="gramEnd"/>
-            <w:r>
-              <w:t>)</w:t>
-            </w:r>
-          </w:p>
-        </w:tc>
-        <w:tc>
-          <w:tcPr>
-            <w:tcW w:w="1868" w:type="pct"/>
-            <w:vAlign w:val="bottom"/>
-          </w:tcPr>
-          <w:p>
-            <w:pPr>
-              <w:pStyle w:val="CellBody"/>
-            </w:pPr>
-            <w:r>
-              <w:t>TR-010, TR-021</w:t>
-            </w:r>
-          </w:p>
-        </w:tc>
-      </w:tr>
-      <w:tr>
-        <w:tc>
-          <w:tcPr>
-            <w:tcW w:w="862" w:type="pct"/>
-            <w:vAlign w:val="bottom"/>
-          </w:tcPr>
-          <w:p>
-            <w:pPr>
-              <w:pStyle w:val="CellBody"/>
-            </w:pPr>
-            <w:r>
-              <w:t>SDD-004</w:t>
-            </w:r>
-          </w:p>
-        </w:tc>
-        <w:tc>
-          <w:tcPr>
-            <w:tcW w:w="2270" w:type="pct"/>
-            <w:vAlign w:val="bottom"/>
-          </w:tcPr>
-          <w:p>
-            <w:pPr>
-              <w:pStyle w:val="CellBody"/>
-            </w:pPr>
-            <w:proofErr w:type="gramStart"/>
-            <w:r>
-              <w:t>Waypoint::</w:t>
-            </w:r>
-            <w:proofErr w:type="spellStart"/>
-            <w:r>
-              <w:t>defaultAltitude</w:t>
-            </w:r>
-            <w:proofErr w:type="spellEnd"/>
-            <w:r>
-              <w:t>(</w:t>
-            </w:r>
-            <w:proofErr w:type="gramEnd"/>
-            <w:r>
-              <w:t>)</w:t>
-            </w:r>
-          </w:p>
-        </w:tc>
-        <w:tc>
-          <w:tcPr>
-            <w:tcW w:w="1868" w:type="pct"/>
-            <w:vAlign w:val="bottom"/>
-          </w:tcPr>
-          <w:p>
-            <w:pPr>
-              <w:pStyle w:val="CellBody"/>
-            </w:pPr>
-            <w:r>
-              <w:t>TR-011, TR-022</w:t>
-            </w:r>
-          </w:p>
-        </w:tc>
-      </w:tr>
-      <w:tr>
-        <w:tc>
-          <w:tcPr>
-            <w:tcW w:w="862" w:type="pct"/>
-            <w:vAlign w:val="bottom"/>
-          </w:tcPr>
-          <w:p>
-            <w:pPr>
-              <w:pStyle w:val="CellBody"/>
-            </w:pPr>
-            <w:r>
               <w:lastRenderedPageBreak/>
-              <w:t>SDD-005</w:t>
-            </w:r>
-          </w:p>
-        </w:tc>
-        <w:tc>
-          <w:tcPr>
-            <w:tcW w:w="2270" w:type="pct"/>
-            <w:vAlign w:val="bottom"/>
-          </w:tcPr>
-          <w:p>
-            <w:pPr>
-              <w:pStyle w:val="CellBody"/>
-            </w:pPr>
-            <w:proofErr w:type="gramStart"/>
-            <w:r>
-              <w:t>Waypoint::</w:t>
-            </w:r>
-            <w:proofErr w:type="spellStart"/>
-            <w:r>
-              <w:t>defaultAltitude</w:t>
-            </w:r>
-            <w:proofErr w:type="spellEnd"/>
-            <w:r>
-              <w:t>(</w:t>
-            </w:r>
-            <w:proofErr w:type="gramEnd"/>
-            <w:r>
-              <w:t>)</w:t>
-            </w:r>
-          </w:p>
-        </w:tc>
-        <w:tc>
-          <w:tcPr>
-            <w:tcW w:w="1868" w:type="pct"/>
-            <w:vAlign w:val="bottom"/>
-          </w:tcPr>
-          <w:p>
-            <w:pPr>
-              <w:pStyle w:val="CellBody"/>
-            </w:pPr>
-            <w:r>
-              <w:t>TR-012, TR-022</w:t>
-            </w:r>
-          </w:p>
-        </w:tc>
-      </w:tr>
-      <w:tr>
-        <w:tc>
-          <w:tcPr>
-            <w:tcW w:w="862" w:type="pct"/>
-            <w:vAlign w:val="bottom"/>
-          </w:tcPr>
-          <w:p>
-            <w:pPr>
-              <w:pStyle w:val="CellBody"/>
-            </w:pPr>
-            <w:r>
-              <w:t>SDD-010</w:t>
-            </w:r>
-          </w:p>
-        </w:tc>
-        <w:tc>
-          <w:tcPr>
-            <w:tcW w:w="2270" w:type="pct"/>
-            <w:vAlign w:val="bottom"/>
-          </w:tcPr>
-          <w:p>
-            <w:pPr>
-              <w:pStyle w:val="CellBody"/>
-            </w:pPr>
-            <w:proofErr w:type="spellStart"/>
-            <w:proofErr w:type="gramStart"/>
-            <w:r>
-              <w:t>MissionManager</w:t>
-            </w:r>
-            <w:proofErr w:type="spellEnd"/>
-            <w:r>
-              <w:t>::</w:t>
-            </w:r>
-            <w:proofErr w:type="spellStart"/>
-            <w:r>
-              <w:t>isValid</w:t>
-            </w:r>
-            <w:proofErr w:type="spellEnd"/>
-            <w:r>
-              <w:t>(</w:t>
-            </w:r>
-            <w:proofErr w:type="gramEnd"/>
-            <w:r>
-              <w:t>)</w:t>
-            </w:r>
-          </w:p>
-        </w:tc>
-        <w:tc>
-          <w:tcPr>
-            <w:tcW w:w="1868" w:type="pct"/>
-            <w:vAlign w:val="bottom"/>
-          </w:tcPr>
-          <w:p>
-            <w:pPr>
-              <w:pStyle w:val="CellBody"/>
-            </w:pPr>
-            <w:r>
-              <w:t>TEST-001, TEST-002, TEST-003</w:t>
-            </w:r>
-          </w:p>
-        </w:tc>
-      </w:tr>
-      <w:tr>
-        <w:tc>
-          <w:tcPr>
-            <w:tcW w:w="862" w:type="pct"/>
-            <w:vAlign w:val="bottom"/>
-          </w:tcPr>
-          <w:p>
-            <w:pPr>
-              <w:pStyle w:val="CellBody"/>
-            </w:pPr>
-            <w:r>
               <w:t>SDD-011</w:t>
             </w:r>
           </w:p>
@@ -16318,8 +16259,8 @@
         <w:tblLook w:val="04A0" w:firstRow="1" w:lastRow="0" w:firstColumn="1" w:lastColumn="0" w:noHBand="0" w:noVBand="1"/>
       </w:tblPr>
       <w:tblGrid>
-        <w:gridCol w:w="3680"/>
-        <w:gridCol w:w="5336"/>
+        <w:gridCol w:w="3718"/>
+        <w:gridCol w:w="5298"/>
       </w:tblGrid>
       <w:tr>
         <w:trPr>
@@ -16706,6 +16647,12 @@
             <w:r>
               <w:t>SRD-005</w:t>
             </w:r>
+            <w:r>
+              <w:t xml:space="preserve">, </w:t>
+            </w:r>
+            <w:r>
+              <w:t>SDD-024</w:t>
+            </w:r>
           </w:p>
         </w:tc>
       </w:tr>
@@ -17015,7 +16962,6 @@
             <w:proofErr w:type="spellStart"/>
             <w:proofErr w:type="gramStart"/>
             <w:r>
-              <w:lastRenderedPageBreak/>
               <w:t>MapEngine</w:t>
             </w:r>
             <w:proofErr w:type="spellEnd"/>
@@ -17112,6 +17058,7 @@
             <w:proofErr w:type="spellStart"/>
             <w:proofErr w:type="gramStart"/>
             <w:r>
+              <w:lastRenderedPageBreak/>
               <w:t>MainWindow</w:t>
             </w:r>
             <w:proofErr w:type="spellEnd"/>
@@ -17339,8 +17286,16 @@
             <w:pPr>
               <w:pStyle w:val="CellBody"/>
             </w:pPr>
-            <w:r>
-              <w:t>tests/tst_missionmanager.cpp</w:t>
+            <w:proofErr w:type="spellStart"/>
+            <w:r>
+              <w:t>missionPlanTest</w:t>
+            </w:r>
+            <w:proofErr w:type="spellEnd"/>
+            <w:r>
+              <w:t>/tst_testmissionplanner</w:t>
+            </w:r>
+            <w:r>
+              <w:t>.cpp</w:t>
             </w:r>
           </w:p>
         </w:tc>
@@ -17369,7 +17324,7 @@
               <w:t>-02</w:t>
             </w:r>
             <w:r>
-              <w:t>8</w:t>
+              <w:t>5</w:t>
             </w:r>
           </w:p>
         </w:tc>
@@ -20639,6 +20594,7 @@
     <w:rsid w:val="00293C01"/>
     <w:rsid w:val="003272EC"/>
     <w:rsid w:val="00381E80"/>
+    <w:rsid w:val="0039517D"/>
     <w:rsid w:val="00410783"/>
     <w:rsid w:val="004348C4"/>
     <w:rsid w:val="005406A5"/>
@@ -20654,6 +20610,7 @@
     <w:rsid w:val="00B763BC"/>
     <w:rsid w:val="00B95FE9"/>
     <w:rsid w:val="00CA0C8E"/>
+    <w:rsid w:val="00CD684D"/>
     <w:rsid w:val="00D06F37"/>
     <w:rsid w:val="00D35E3C"/>
     <w:rsid w:val="00D5206A"/>

</xml_diff>

<commit_message>
removed the cover letter
</commit_message>
<xml_diff>
--- a/docs/Mission Planner.docx
+++ b/docs/Mission Planner.docx
@@ -2,705 +2,6 @@
 <file path=word/document.xml><?xml version="1.0" encoding="utf-8"?>
 <w:document xmlns:wpc="http://schemas.microsoft.com/office/word/2010/wordprocessingCanvas" xmlns:cx="http://schemas.microsoft.com/office/drawing/2014/chartex" xmlns:cx1="http://schemas.microsoft.com/office/drawing/2015/9/8/chartex" xmlns:cx2="http://schemas.microsoft.com/office/drawing/2015/10/21/chartex" xmlns:cx3="http://schemas.microsoft.com/office/drawing/2016/5/9/chartex" xmlns:cx4="http://schemas.microsoft.com/office/drawing/2016/5/10/chartex" xmlns:cx5="http://schemas.microsoft.com/office/drawing/2016/5/11/chartex" xmlns:cx6="http://schemas.microsoft.com/office/drawing/2016/5/12/chartex" xmlns:cx7="http://schemas.microsoft.com/office/drawing/2016/5/13/chartex" xmlns:cx8="http://schemas.microsoft.com/office/drawing/2016/5/14/chartex" xmlns:mc="http://schemas.openxmlformats.org/markup-compatibility/2006" xmlns:aink="http://schemas.microsoft.com/office/drawing/2016/ink" xmlns:am3d="http://schemas.microsoft.com/office/drawing/2017/model3d" xmlns:o="urn:schemas-microsoft-com:office:office" xmlns:oel="http://schemas.microsoft.com/office/2019/extlst" xmlns:r="http://schemas.openxmlformats.org/officeDocument/2006/relationships" xmlns:m="http://schemas.openxmlformats.org/officeDocument/2006/math" xmlns:v="urn:schemas-microsoft-com:vml" xmlns:wp14="http://schemas.microsoft.com/office/word/2010/wordprocessingDrawing" xmlns:wp="http://schemas.openxmlformats.org/drawingml/2006/wordprocessingDrawing" xmlns:w10="urn:schemas-microsoft-com:office:word" xmlns:w="http://schemas.openxmlformats.org/wordprocessingml/2006/main" xmlns:w14="http://schemas.microsoft.com/office/word/2010/wordml" xmlns:w15="http://schemas.microsoft.com/office/word/2012/wordml" xmlns:w16cex="http://schemas.microsoft.com/office/word/2018/wordml/cex" xmlns:w16cid="http://schemas.microsoft.com/office/word/2016/wordml/cid" xmlns:w16="http://schemas.microsoft.com/office/word/2018/wordml" xmlns:w16du="http://schemas.microsoft.com/office/word/2023/wordml/word16du" xmlns:w16sdtdh="http://schemas.microsoft.com/office/word/2020/wordml/sdtdatahash" xmlns:w16sdtfl="http://schemas.microsoft.com/office/word/2024/wordml/sdtformatlock" xmlns:w16se="http://schemas.microsoft.com/office/word/2015/wordml/symex" xmlns:wpg="http://schemas.microsoft.com/office/word/2010/wordprocessingGroup" xmlns:wpi="http://schemas.microsoft.com/office/word/2010/wordprocessingInk" xmlns:wne="http://schemas.microsoft.com/office/word/2006/wordml" xmlns:wps="http://schemas.microsoft.com/office/word/2010/wordprocessingShape" mc:Ignorable="w14 w15 w16se w16cid w16 w16cex w16sdtdh w16sdtfl w16du wp14">
   <w:body>
-    <w:sdt>
-      <w:sdtPr>
-        <w:rPr>
-          <w:color w:val="FFFFFF" w:themeColor="background1"/>
-        </w:rPr>
-        <w:id w:val="1273740377"/>
-        <w:docPartObj>
-          <w:docPartGallery w:val="Cover Pages"/>
-          <w:docPartUnique/>
-        </w:docPartObj>
-      </w:sdtPr>
-      <w:sdtContent>
-        <w:p>
-          <w:pPr>
-            <w:rPr>
-              <w:color w:val="FFFFFF" w:themeColor="background1"/>
-            </w:rPr>
-          </w:pPr>
-          <w:r>
-            <w:rPr>
-              <w:rFonts w:asciiTheme="majorHAnsi" w:eastAsiaTheme="majorEastAsia" w:hAnsiTheme="majorHAnsi" w:cstheme="majorBidi"/>
-              <w:noProof/>
-              <w:spacing w:val="-10"/>
-              <w:kern w:val="28"/>
-              <w:sz w:val="56"/>
-              <w:szCs w:val="56"/>
-            </w:rPr>
-            <mc:AlternateContent>
-              <mc:Choice Requires="wps">
-                <w:drawing>
-                  <wp:anchor distT="0" distB="0" distL="114300" distR="114300" simplePos="0" relativeHeight="251659264" behindDoc="0" locked="0" layoutInCell="1" allowOverlap="1" wp14:anchorId="321645C8" wp14:editId="1B7FE36C">
-                    <wp:simplePos x="0" y="0"/>
-                    <wp:positionH relativeFrom="page">
-                      <wp:align>center</wp:align>
-                    </wp:positionH>
-                    <wp:positionV relativeFrom="page">
-                      <wp:align>center</wp:align>
-                    </wp:positionV>
-                    <wp:extent cx="1712890" cy="3840480"/>
-                    <wp:effectExtent l="0" t="0" r="1270" b="0"/>
-                    <wp:wrapNone/>
-                    <wp:docPr id="138" name="Text Box 139"/>
-                    <wp:cNvGraphicFramePr/>
-                    <a:graphic xmlns:a="http://schemas.openxmlformats.org/drawingml/2006/main">
-                      <a:graphicData uri="http://schemas.microsoft.com/office/word/2010/wordprocessingShape">
-                        <wps:wsp>
-                          <wps:cNvSpPr txBox="1"/>
-                          <wps:spPr>
-                            <a:xfrm>
-                              <a:off x="0" y="0"/>
-                              <a:ext cx="1712890" cy="3840480"/>
-                            </a:xfrm>
-                            <a:prstGeom prst="rect">
-                              <a:avLst/>
-                            </a:prstGeom>
-                            <a:solidFill>
-                              <a:schemeClr val="lt1"/>
-                            </a:solidFill>
-                            <a:ln w="6350">
-                              <a:noFill/>
-                            </a:ln>
-                            <a:effectLst/>
-                          </wps:spPr>
-                          <wps:style>
-                            <a:lnRef idx="0">
-                              <a:schemeClr val="accent1"/>
-                            </a:lnRef>
-                            <a:fillRef idx="0">
-                              <a:schemeClr val="accent1"/>
-                            </a:fillRef>
-                            <a:effectRef idx="0">
-                              <a:schemeClr val="accent1"/>
-                            </a:effectRef>
-                            <a:fontRef idx="minor">
-                              <a:schemeClr val="dk1"/>
-                            </a:fontRef>
-                          </wps:style>
-                          <wps:txbx>
-                            <w:txbxContent>
-                              <w:tbl>
-                                <w:tblPr>
-                                  <w:tblW w:w="5000" w:type="pct"/>
-                                  <w:jc w:val="center"/>
-                                  <w:tblBorders>
-                                    <w:insideV w:val="single" w:sz="12" w:space="0" w:color="E97132" w:themeColor="accent2"/>
-                                  </w:tblBorders>
-                                  <w:tblCellMar>
-                                    <w:top w:w="1296" w:type="dxa"/>
-                                    <w:left w:w="360" w:type="dxa"/>
-                                    <w:bottom w:w="1296" w:type="dxa"/>
-                                    <w:right w:w="360" w:type="dxa"/>
-                                  </w:tblCellMar>
-                                  <w:tblLook w:val="04A0" w:firstRow="1" w:lastRow="0" w:firstColumn="1" w:lastColumn="0" w:noHBand="0" w:noVBand="1"/>
-                                </w:tblPr>
-                                <w:tblGrid>
-                                  <w:gridCol w:w="6870"/>
-                                  <w:gridCol w:w="2371"/>
-                                </w:tblGrid>
-                                <w:tr>
-                                  <w:trPr>
-                                    <w:jc w:val="center"/>
-                                  </w:trPr>
-                                  <w:tc>
-                                    <w:tcPr>
-                                      <w:tcW w:w="2568" w:type="pct"/>
-                                      <w:vAlign w:val="center"/>
-                                    </w:tcPr>
-                                    <w:p>
-                                      <w:pPr>
-                                        <w:jc w:val="right"/>
-                                      </w:pPr>
-                                      <w:r>
-                                        <w:rPr>
-                                          <w:noProof/>
-                                        </w:rPr>
-                                        <w:drawing>
-                                          <wp:inline distT="0" distB="0" distL="0" distR="0" wp14:anchorId="463C2F43" wp14:editId="2EC74FF8">
-                                            <wp:extent cx="3901440" cy="2788920"/>
-                                            <wp:effectExtent l="0" t="0" r="3810" b="0"/>
-                                            <wp:docPr id="908205586" name="Picture 6"/>
-                                            <wp:cNvGraphicFramePr>
-                                              <a:graphicFrameLocks xmlns:a="http://schemas.openxmlformats.org/drawingml/2006/main" noChangeAspect="1"/>
-                                            </wp:cNvGraphicFramePr>
-                                            <a:graphic xmlns:a="http://schemas.openxmlformats.org/drawingml/2006/main">
-                                              <a:graphicData uri="http://schemas.openxmlformats.org/drawingml/2006/picture">
-                                                <pic:pic xmlns:pic="http://schemas.openxmlformats.org/drawingml/2006/picture">
-                                                  <pic:nvPicPr>
-                                                    <pic:cNvPr id="908205586" name="Picture 908205586"/>
-                                                    <pic:cNvPicPr/>
-                                                  </pic:nvPicPr>
-                                                  <pic:blipFill>
-                                                    <a:blip r:embed="rId8">
-                                                      <a:extLst>
-                                                        <a:ext uri="{28A0092B-C50C-407E-A947-70E740481C1C}">
-                                                          <a14:useLocalDpi xmlns:a14="http://schemas.microsoft.com/office/drawing/2010/main" val="0"/>
-                                                        </a:ext>
-                                                        <a:ext uri="{837473B0-CC2E-450A-ABE3-18F120FF3D39}">
-                                                          <a1611:picAttrSrcUrl xmlns:a1611="http://schemas.microsoft.com/office/drawing/2016/11/main" r:id="rId9"/>
-                                                        </a:ext>
-                                                      </a:extLst>
-                                                    </a:blip>
-                                                    <a:stretch>
-                                                      <a:fillRect/>
-                                                    </a:stretch>
-                                                  </pic:blipFill>
-                                                  <pic:spPr>
-                                                    <a:xfrm>
-                                                      <a:off x="0" y="0"/>
-                                                      <a:ext cx="3901440" cy="2788920"/>
-                                                    </a:xfrm>
-                                                    <a:prstGeom prst="rect">
-                                                      <a:avLst/>
-                                                    </a:prstGeom>
-                                                  </pic:spPr>
-                                                </pic:pic>
-                                              </a:graphicData>
-                                            </a:graphic>
-                                          </wp:inline>
-                                        </w:drawing>
-                                      </w:r>
-                                    </w:p>
-                                    <w:sdt>
-                                      <w:sdtPr>
-                                        <w:rPr>
-                                          <w:caps/>
-                                          <w:color w:val="191919" w:themeColor="text1" w:themeTint="E6"/>
-                                          <w:sz w:val="72"/>
-                                          <w:szCs w:val="72"/>
-                                        </w:rPr>
-                                        <w:alias w:val="Title"/>
-                                        <w:tag w:val=""/>
-                                        <w:id w:val="-438379639"/>
-                                        <w:dataBinding w:prefixMappings="xmlns:ns0='http://purl.org/dc/elements/1.1/' xmlns:ns1='http://schemas.openxmlformats.org/package/2006/metadata/core-properties' " w:xpath="/ns1:coreProperties[1]/ns0:title[1]" w:storeItemID="{6C3C8BC8-F283-45AE-878A-BAB7291924A1}"/>
-                                        <w:text/>
-                                      </w:sdtPr>
-                                      <w:sdtContent>
-                                        <w:p>
-                                          <w:pPr>
-                                            <w:pStyle w:val="NoSpacing"/>
-                                            <w:spacing w:line="312" w:lineRule="auto"/>
-                                            <w:jc w:val="right"/>
-                                            <w:rPr>
-                                              <w:caps/>
-                                              <w:color w:val="191919" w:themeColor="text1" w:themeTint="E6"/>
-                                              <w:sz w:val="72"/>
-                                              <w:szCs w:val="72"/>
-                                            </w:rPr>
-                                          </w:pPr>
-                                          <w:r>
-                                            <w:rPr>
-                                              <w:caps/>
-                                              <w:color w:val="191919" w:themeColor="text1" w:themeTint="E6"/>
-                                              <w:sz w:val="72"/>
-                                              <w:szCs w:val="72"/>
-                                            </w:rPr>
-                                            <w:t>Mission Planner</w:t>
-                                          </w:r>
-                                        </w:p>
-                                      </w:sdtContent>
-                                    </w:sdt>
-                                    <w:sdt>
-                                      <w:sdtPr>
-                                        <w:rPr>
-                                          <w:color w:val="000000" w:themeColor="text1"/>
-                                        </w:rPr>
-                                        <w:alias w:val="Subtitle"/>
-                                        <w:tag w:val=""/>
-                                        <w:id w:val="1354072561"/>
-                                        <w:showingPlcHdr/>
-                                        <w:dataBinding w:prefixMappings="xmlns:ns0='http://purl.org/dc/elements/1.1/' xmlns:ns1='http://schemas.openxmlformats.org/package/2006/metadata/core-properties' " w:xpath="/ns1:coreProperties[1]/ns0:subject[1]" w:storeItemID="{6C3C8BC8-F283-45AE-878A-BAB7291924A1}"/>
-                                        <w:text/>
-                                      </w:sdtPr>
-                                      <w:sdtContent>
-                                        <w:p>
-                                          <w:pPr>
-                                            <w:jc w:val="right"/>
-                                          </w:pPr>
-                                          <w:r>
-                                            <w:rPr>
-                                              <w:color w:val="000000" w:themeColor="text1"/>
-                                            </w:rPr>
-                                            <w:t xml:space="preserve">     </w:t>
-                                          </w:r>
-                                        </w:p>
-                                      </w:sdtContent>
-                                    </w:sdt>
-                                  </w:tc>
-                                  <w:tc>
-                                    <w:tcPr>
-                                      <w:tcW w:w="2432" w:type="pct"/>
-                                      <w:vAlign w:val="center"/>
-                                    </w:tcPr>
-                                    <w:p>
-                                      <w:pPr>
-                                        <w:pStyle w:val="NoSpacing"/>
-                                        <w:rPr>
-                                          <w:caps/>
-                                          <w:color w:val="E97132" w:themeColor="accent2"/>
-                                          <w:sz w:val="26"/>
-                                          <w:szCs w:val="26"/>
-                                        </w:rPr>
-                                      </w:pPr>
-                                      <w:r>
-                                        <w:rPr>
-                                          <w:caps/>
-                                          <w:color w:val="E97132" w:themeColor="accent2"/>
-                                          <w:sz w:val="26"/>
-                                          <w:szCs w:val="26"/>
-                                        </w:rPr>
-                                        <w:t>Abstract</w:t>
-                                      </w:r>
-                                    </w:p>
-                                    <w:sdt>
-                                      <w:sdtPr>
-                                        <w:rPr>
-                                          <w:color w:val="000000" w:themeColor="text1"/>
-                                        </w:rPr>
-                                        <w:alias w:val="Abstract"/>
-                                        <w:tag w:val=""/>
-                                        <w:id w:val="-2036181933"/>
-                                        <w:dataBinding w:prefixMappings="xmlns:ns0='http://schemas.microsoft.com/office/2006/coverPageProps' " w:xpath="/ns0:CoverPageProperties[1]/ns0:Abstract[1]" w:storeItemID="{55AF091B-3C7A-41E3-B477-F2FDAA23CFDA}"/>
-                                        <w:text/>
-                                      </w:sdtPr>
-                                      <w:sdtContent>
-                                        <w:p>
-                                          <w:pPr>
-                                            <w:rPr>
-                                              <w:color w:val="000000" w:themeColor="text1"/>
-                                            </w:rPr>
-                                          </w:pPr>
-                                          <w:r>
-                                            <w:rPr>
-                                              <w:color w:val="000000" w:themeColor="text1"/>
-                                            </w:rPr>
-                                            <w:t xml:space="preserve">Mission Planner is a Qt6-based desktop application developed for </w:t>
-                                          </w:r>
-                                          <w:proofErr w:type="spellStart"/>
-                                          <w:r>
-                                            <w:rPr>
-                                              <w:color w:val="000000" w:themeColor="text1"/>
-                                            </w:rPr>
-                                            <w:t>Avilus</w:t>
-                                          </w:r>
-                                          <w:proofErr w:type="spellEnd"/>
-                                          <w:r>
-                                            <w:rPr>
-                                              <w:color w:val="000000" w:themeColor="text1"/>
-                                            </w:rPr>
-                                            <w:t xml:space="preserve"> that enables operators to plan unmanned aerial vehicle missions on an interactive 2D map canvas. The application constructs a VTOL flight trajectory, validates the mission against safety constraints, and outputs the waypoint sequence for upload. This document covers the system requirements, software design, and test specifications with full bidirectional traceability to implementation and test. </w:t>
-                                          </w:r>
-                                        </w:p>
-                                      </w:sdtContent>
-                                    </w:sdt>
-                                    <w:sdt>
-                                      <w:sdtPr>
-                                        <w:rPr>
-                                          <w:color w:val="E97132" w:themeColor="accent2"/>
-                                          <w:sz w:val="26"/>
-                                          <w:szCs w:val="26"/>
-                                        </w:rPr>
-                                        <w:alias w:val="Author"/>
-                                        <w:tag w:val=""/>
-                                        <w:id w:val="-279026076"/>
-                                        <w:dataBinding w:prefixMappings="xmlns:ns0='http://purl.org/dc/elements/1.1/' xmlns:ns1='http://schemas.openxmlformats.org/package/2006/metadata/core-properties' " w:xpath="/ns1:coreProperties[1]/ns0:creator[1]" w:storeItemID="{6C3C8BC8-F283-45AE-878A-BAB7291924A1}"/>
-                                        <w:text/>
-                                      </w:sdtPr>
-                                      <w:sdtContent>
-                                        <w:p>
-                                          <w:pPr>
-                                            <w:pStyle w:val="NoSpacing"/>
-                                            <w:rPr>
-                                              <w:color w:val="E97132" w:themeColor="accent2"/>
-                                              <w:sz w:val="26"/>
-                                              <w:szCs w:val="26"/>
-                                            </w:rPr>
-                                          </w:pPr>
-                                          <w:r>
-                                            <w:rPr>
-                                              <w:color w:val="E97132" w:themeColor="accent2"/>
-                                              <w:sz w:val="26"/>
-                                              <w:szCs w:val="26"/>
-                                            </w:rPr>
-                                            <w:t xml:space="preserve">Ravi Jayanagara </w:t>
-                                          </w:r>
-                                          <w:proofErr w:type="spellStart"/>
-                                          <w:r>
-                                            <w:rPr>
-                                              <w:color w:val="E97132" w:themeColor="accent2"/>
-                                              <w:sz w:val="26"/>
-                                              <w:szCs w:val="26"/>
-                                            </w:rPr>
-                                            <w:t>Krishnegowda</w:t>
-                                          </w:r>
-                                          <w:proofErr w:type="spellEnd"/>
-                                        </w:p>
-                                      </w:sdtContent>
-                                    </w:sdt>
-                                    <w:p>
-                                      <w:pPr>
-                                        <w:pStyle w:val="NoSpacing"/>
-                                      </w:pPr>
-                                      <w:sdt>
-                                        <w:sdtPr>
-                                          <w:rPr>
-                                            <w:color w:val="0E2841" w:themeColor="text2"/>
-                                          </w:rPr>
-                                          <w:alias w:val="Course"/>
-                                          <w:tag w:val="Course"/>
-                                          <w:id w:val="-710501431"/>
-                                          <w:dataBinding w:prefixMappings="xmlns:ns0='http://purl.org/dc/elements/1.1/' xmlns:ns1='http://schemas.openxmlformats.org/package/2006/metadata/core-properties' " w:xpath="/ns1:coreProperties[1]/ns1:category[1]" w:storeItemID="{6C3C8BC8-F283-45AE-878A-BAB7291924A1}"/>
-                                          <w:text/>
-                                        </w:sdtPr>
-                                        <w:sdtContent>
-                                          <w:r>
-                                            <w:rPr>
-                                              <w:color w:val="0E2841" w:themeColor="text2"/>
-                                            </w:rPr>
-                                            <w:t>System Engineer</w:t>
-                                          </w:r>
-                                        </w:sdtContent>
-                                      </w:sdt>
-                                    </w:p>
-                                  </w:tc>
-                                </w:tr>
-                              </w:tbl>
-                              <w:p/>
-                            </w:txbxContent>
-                          </wps:txbx>
-                          <wps:bodyPr rot="0" spcFirstLastPara="0" vertOverflow="overflow" horzOverflow="overflow" vert="horz" wrap="square" lIns="0" tIns="0" rIns="0" bIns="0" numCol="1" spcCol="0" rtlCol="0" fromWordArt="0" anchor="ctr" anchorCtr="0" forceAA="0" compatLnSpc="1">
-                            <a:prstTxWarp prst="textNoShape">
-                              <a:avLst/>
-                            </a:prstTxWarp>
-                            <a:noAutofit/>
-                          </wps:bodyPr>
-                        </wps:wsp>
-                      </a:graphicData>
-                    </a:graphic>
-                    <wp14:sizeRelH relativeFrom="page">
-                      <wp14:pctWidth>94100</wp14:pctWidth>
-                    </wp14:sizeRelH>
-                    <wp14:sizeRelV relativeFrom="page">
-                      <wp14:pctHeight>77300</wp14:pctHeight>
-                    </wp14:sizeRelV>
-                  </wp:anchor>
-                </w:drawing>
-              </mc:Choice>
-              <mc:Fallback>
-                <w:pict>
-                  <v:shapetype w14:anchorId="321645C8" id="_x0000_t202" coordsize="21600,21600" o:spt="202" path="m,l,21600r21600,l21600,xe">
-                    <v:stroke joinstyle="miter"/>
-                    <v:path gradientshapeok="t" o:connecttype="rect"/>
-                  </v:shapetype>
-                  <v:shape id="Text Box 139" o:spid="_x0000_s1026" type="#_x0000_t202" style="position:absolute;margin-left:0;margin-top:0;width:134.85pt;height:302.4pt;z-index:251659264;visibility:visible;mso-wrap-style:square;mso-width-percent:941;mso-height-percent:773;mso-wrap-distance-left:9pt;mso-wrap-distance-top:0;mso-wrap-distance-right:9pt;mso-wrap-distance-bottom:0;mso-position-horizontal:center;mso-position-horizontal-relative:page;mso-position-vertical:center;mso-position-vertical-relative:page;mso-width-percent:941;mso-height-percent:773;mso-width-relative:page;mso-height-relative:page;v-text-anchor:middle" o:gfxdata="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" fillcolor="white [3201]" stroked="f" strokeweight=".5pt">
-                    <v:textbox inset="0,0,0,0">
-                      <w:txbxContent>
-                        <w:tbl>
-                          <w:tblPr>
-                            <w:tblW w:w="5000" w:type="pct"/>
-                            <w:jc w:val="center"/>
-                            <w:tblBorders>
-                              <w:insideV w:val="single" w:sz="12" w:space="0" w:color="E97132" w:themeColor="accent2"/>
-                            </w:tblBorders>
-                            <w:tblCellMar>
-                              <w:top w:w="1296" w:type="dxa"/>
-                              <w:left w:w="360" w:type="dxa"/>
-                              <w:bottom w:w="1296" w:type="dxa"/>
-                              <w:right w:w="360" w:type="dxa"/>
-                            </w:tblCellMar>
-                            <w:tblLook w:val="04A0" w:firstRow="1" w:lastRow="0" w:firstColumn="1" w:lastColumn="0" w:noHBand="0" w:noVBand="1"/>
-                          </w:tblPr>
-                          <w:tblGrid>
-                            <w:gridCol w:w="6870"/>
-                            <w:gridCol w:w="2371"/>
-                          </w:tblGrid>
-                          <w:tr>
-                            <w:trPr>
-                              <w:jc w:val="center"/>
-                            </w:trPr>
-                            <w:tc>
-                              <w:tcPr>
-                                <w:tcW w:w="2568" w:type="pct"/>
-                                <w:vAlign w:val="center"/>
-                              </w:tcPr>
-                              <w:p>
-                                <w:pPr>
-                                  <w:jc w:val="right"/>
-                                </w:pPr>
-                                <w:r>
-                                  <w:rPr>
-                                    <w:noProof/>
-                                  </w:rPr>
-                                  <w:drawing>
-                                    <wp:inline distT="0" distB="0" distL="0" distR="0" wp14:anchorId="463C2F43" wp14:editId="2EC74FF8">
-                                      <wp:extent cx="3901440" cy="2788920"/>
-                                      <wp:effectExtent l="0" t="0" r="3810" b="0"/>
-                                      <wp:docPr id="908205586" name="Picture 6"/>
-                                      <wp:cNvGraphicFramePr>
-                                        <a:graphicFrameLocks xmlns:a="http://schemas.openxmlformats.org/drawingml/2006/main" noChangeAspect="1"/>
-                                      </wp:cNvGraphicFramePr>
-                                      <a:graphic xmlns:a="http://schemas.openxmlformats.org/drawingml/2006/main">
-                                        <a:graphicData uri="http://schemas.openxmlformats.org/drawingml/2006/picture">
-                                          <pic:pic xmlns:pic="http://schemas.openxmlformats.org/drawingml/2006/picture">
-                                            <pic:nvPicPr>
-                                              <pic:cNvPr id="908205586" name="Picture 908205586"/>
-                                              <pic:cNvPicPr/>
-                                            </pic:nvPicPr>
-                                            <pic:blipFill>
-                                              <a:blip r:embed="rId8">
-                                                <a:extLst>
-                                                  <a:ext uri="{28A0092B-C50C-407E-A947-70E740481C1C}">
-                                                    <a14:useLocalDpi xmlns:a14="http://schemas.microsoft.com/office/drawing/2010/main" val="0"/>
-                                                  </a:ext>
-                                                  <a:ext uri="{837473B0-CC2E-450A-ABE3-18F120FF3D39}">
-                                                    <a1611:picAttrSrcUrl xmlns:a1611="http://schemas.microsoft.com/office/drawing/2016/11/main" r:id="rId9"/>
-                                                  </a:ext>
-                                                </a:extLst>
-                                              </a:blip>
-                                              <a:stretch>
-                                                <a:fillRect/>
-                                              </a:stretch>
-                                            </pic:blipFill>
-                                            <pic:spPr>
-                                              <a:xfrm>
-                                                <a:off x="0" y="0"/>
-                                                <a:ext cx="3901440" cy="2788920"/>
-                                              </a:xfrm>
-                                              <a:prstGeom prst="rect">
-                                                <a:avLst/>
-                                              </a:prstGeom>
-                                            </pic:spPr>
-                                          </pic:pic>
-                                        </a:graphicData>
-                                      </a:graphic>
-                                    </wp:inline>
-                                  </w:drawing>
-                                </w:r>
-                              </w:p>
-                              <w:sdt>
-                                <w:sdtPr>
-                                  <w:rPr>
-                                    <w:caps/>
-                                    <w:color w:val="191919" w:themeColor="text1" w:themeTint="E6"/>
-                                    <w:sz w:val="72"/>
-                                    <w:szCs w:val="72"/>
-                                  </w:rPr>
-                                  <w:alias w:val="Title"/>
-                                  <w:tag w:val=""/>
-                                  <w:id w:val="-438379639"/>
-                                  <w:dataBinding w:prefixMappings="xmlns:ns0='http://purl.org/dc/elements/1.1/' xmlns:ns1='http://schemas.openxmlformats.org/package/2006/metadata/core-properties' " w:xpath="/ns1:coreProperties[1]/ns0:title[1]" w:storeItemID="{6C3C8BC8-F283-45AE-878A-BAB7291924A1}"/>
-                                  <w:text/>
-                                </w:sdtPr>
-                                <w:sdtContent>
-                                  <w:p>
-                                    <w:pPr>
-                                      <w:pStyle w:val="NoSpacing"/>
-                                      <w:spacing w:line="312" w:lineRule="auto"/>
-                                      <w:jc w:val="right"/>
-                                      <w:rPr>
-                                        <w:caps/>
-                                        <w:color w:val="191919" w:themeColor="text1" w:themeTint="E6"/>
-                                        <w:sz w:val="72"/>
-                                        <w:szCs w:val="72"/>
-                                      </w:rPr>
-                                    </w:pPr>
-                                    <w:r>
-                                      <w:rPr>
-                                        <w:caps/>
-                                        <w:color w:val="191919" w:themeColor="text1" w:themeTint="E6"/>
-                                        <w:sz w:val="72"/>
-                                        <w:szCs w:val="72"/>
-                                      </w:rPr>
-                                      <w:t>Mission Planner</w:t>
-                                    </w:r>
-                                  </w:p>
-                                </w:sdtContent>
-                              </w:sdt>
-                              <w:sdt>
-                                <w:sdtPr>
-                                  <w:rPr>
-                                    <w:color w:val="000000" w:themeColor="text1"/>
-                                  </w:rPr>
-                                  <w:alias w:val="Subtitle"/>
-                                  <w:tag w:val=""/>
-                                  <w:id w:val="1354072561"/>
-                                  <w:showingPlcHdr/>
-                                  <w:dataBinding w:prefixMappings="xmlns:ns0='http://purl.org/dc/elements/1.1/' xmlns:ns1='http://schemas.openxmlformats.org/package/2006/metadata/core-properties' " w:xpath="/ns1:coreProperties[1]/ns0:subject[1]" w:storeItemID="{6C3C8BC8-F283-45AE-878A-BAB7291924A1}"/>
-                                  <w:text/>
-                                </w:sdtPr>
-                                <w:sdtContent>
-                                  <w:p>
-                                    <w:pPr>
-                                      <w:jc w:val="right"/>
-                                    </w:pPr>
-                                    <w:r>
-                                      <w:rPr>
-                                        <w:color w:val="000000" w:themeColor="text1"/>
-                                      </w:rPr>
-                                      <w:t xml:space="preserve">     </w:t>
-                                    </w:r>
-                                  </w:p>
-                                </w:sdtContent>
-                              </w:sdt>
-                            </w:tc>
-                            <w:tc>
-                              <w:tcPr>
-                                <w:tcW w:w="2432" w:type="pct"/>
-                                <w:vAlign w:val="center"/>
-                              </w:tcPr>
-                              <w:p>
-                                <w:pPr>
-                                  <w:pStyle w:val="NoSpacing"/>
-                                  <w:rPr>
-                                    <w:caps/>
-                                    <w:color w:val="E97132" w:themeColor="accent2"/>
-                                    <w:sz w:val="26"/>
-                                    <w:szCs w:val="26"/>
-                                  </w:rPr>
-                                </w:pPr>
-                                <w:r>
-                                  <w:rPr>
-                                    <w:caps/>
-                                    <w:color w:val="E97132" w:themeColor="accent2"/>
-                                    <w:sz w:val="26"/>
-                                    <w:szCs w:val="26"/>
-                                  </w:rPr>
-                                  <w:t>Abstract</w:t>
-                                </w:r>
-                              </w:p>
-                              <w:sdt>
-                                <w:sdtPr>
-                                  <w:rPr>
-                                    <w:color w:val="000000" w:themeColor="text1"/>
-                                  </w:rPr>
-                                  <w:alias w:val="Abstract"/>
-                                  <w:tag w:val=""/>
-                                  <w:id w:val="-2036181933"/>
-                                  <w:dataBinding w:prefixMappings="xmlns:ns0='http://schemas.microsoft.com/office/2006/coverPageProps' " w:xpath="/ns0:CoverPageProperties[1]/ns0:Abstract[1]" w:storeItemID="{55AF091B-3C7A-41E3-B477-F2FDAA23CFDA}"/>
-                                  <w:text/>
-                                </w:sdtPr>
-                                <w:sdtContent>
-                                  <w:p>
-                                    <w:pPr>
-                                      <w:rPr>
-                                        <w:color w:val="000000" w:themeColor="text1"/>
-                                      </w:rPr>
-                                    </w:pPr>
-                                    <w:r>
-                                      <w:rPr>
-                                        <w:color w:val="000000" w:themeColor="text1"/>
-                                      </w:rPr>
-                                      <w:t xml:space="preserve">Mission Planner is a Qt6-based desktop application developed for </w:t>
-                                    </w:r>
-                                    <w:proofErr w:type="spellStart"/>
-                                    <w:r>
-                                      <w:rPr>
-                                        <w:color w:val="000000" w:themeColor="text1"/>
-                                      </w:rPr>
-                                      <w:t>Avilus</w:t>
-                                    </w:r>
-                                    <w:proofErr w:type="spellEnd"/>
-                                    <w:r>
-                                      <w:rPr>
-                                        <w:color w:val="000000" w:themeColor="text1"/>
-                                      </w:rPr>
-                                      <w:t xml:space="preserve"> that enables operators to plan unmanned aerial vehicle missions on an interactive 2D map canvas. The application constructs a VTOL flight trajectory, validates the mission against safety constraints, and outputs the waypoint sequence for upload. This document covers the system requirements, software design, and test specifications with full bidirectional traceability to implementation and test. </w:t>
-                                    </w:r>
-                                  </w:p>
-                                </w:sdtContent>
-                              </w:sdt>
-                              <w:sdt>
-                                <w:sdtPr>
-                                  <w:rPr>
-                                    <w:color w:val="E97132" w:themeColor="accent2"/>
-                                    <w:sz w:val="26"/>
-                                    <w:szCs w:val="26"/>
-                                  </w:rPr>
-                                  <w:alias w:val="Author"/>
-                                  <w:tag w:val=""/>
-                                  <w:id w:val="-279026076"/>
-                                  <w:dataBinding w:prefixMappings="xmlns:ns0='http://purl.org/dc/elements/1.1/' xmlns:ns1='http://schemas.openxmlformats.org/package/2006/metadata/core-properties' " w:xpath="/ns1:coreProperties[1]/ns0:creator[1]" w:storeItemID="{6C3C8BC8-F283-45AE-878A-BAB7291924A1}"/>
-                                  <w:text/>
-                                </w:sdtPr>
-                                <w:sdtContent>
-                                  <w:p>
-                                    <w:pPr>
-                                      <w:pStyle w:val="NoSpacing"/>
-                                      <w:rPr>
-                                        <w:color w:val="E97132" w:themeColor="accent2"/>
-                                        <w:sz w:val="26"/>
-                                        <w:szCs w:val="26"/>
-                                      </w:rPr>
-                                    </w:pPr>
-                                    <w:r>
-                                      <w:rPr>
-                                        <w:color w:val="E97132" w:themeColor="accent2"/>
-                                        <w:sz w:val="26"/>
-                                        <w:szCs w:val="26"/>
-                                      </w:rPr>
-                                      <w:t xml:space="preserve">Ravi Jayanagara </w:t>
-                                    </w:r>
-                                    <w:proofErr w:type="spellStart"/>
-                                    <w:r>
-                                      <w:rPr>
-                                        <w:color w:val="E97132" w:themeColor="accent2"/>
-                                        <w:sz w:val="26"/>
-                                        <w:szCs w:val="26"/>
-                                      </w:rPr>
-                                      <w:t>Krishnegowda</w:t>
-                                    </w:r>
-                                    <w:proofErr w:type="spellEnd"/>
-                                  </w:p>
-                                </w:sdtContent>
-                              </w:sdt>
-                              <w:p>
-                                <w:pPr>
-                                  <w:pStyle w:val="NoSpacing"/>
-                                </w:pPr>
-                                <w:sdt>
-                                  <w:sdtPr>
-                                    <w:rPr>
-                                      <w:color w:val="0E2841" w:themeColor="text2"/>
-                                    </w:rPr>
-                                    <w:alias w:val="Course"/>
-                                    <w:tag w:val="Course"/>
-                                    <w:id w:val="-710501431"/>
-                                    <w:dataBinding w:prefixMappings="xmlns:ns0='http://purl.org/dc/elements/1.1/' xmlns:ns1='http://schemas.openxmlformats.org/package/2006/metadata/core-properties' " w:xpath="/ns1:coreProperties[1]/ns1:category[1]" w:storeItemID="{6C3C8BC8-F283-45AE-878A-BAB7291924A1}"/>
-                                    <w:text/>
-                                  </w:sdtPr>
-                                  <w:sdtContent>
-                                    <w:r>
-                                      <w:rPr>
-                                        <w:color w:val="0E2841" w:themeColor="text2"/>
-                                      </w:rPr>
-                                      <w:t>System Engineer</w:t>
-                                    </w:r>
-                                  </w:sdtContent>
-                                </w:sdt>
-                              </w:p>
-                            </w:tc>
-                          </w:tr>
-                        </w:tbl>
-                        <w:p/>
-                      </w:txbxContent>
-                    </v:textbox>
-                    <w10:wrap anchorx="page" anchory="page"/>
-                  </v:shape>
-                </w:pict>
-              </mc:Fallback>
-            </mc:AlternateContent>
-          </w:r>
-          <w:r>
-            <w:rPr>
-              <w:color w:val="FFFFFF" w:themeColor="background1"/>
-            </w:rPr>
-            <w:br w:type="page"/>
-          </w:r>
-        </w:p>
-      </w:sdtContent>
-    </w:sdt>
     <w:p>
       <w:pPr>
         <w:pStyle w:val="Title"/>
@@ -10568,7 +9869,7 @@
                 <w:lang w:val="en-US"/>
                 <w14:ligatures w14:val="none"/>
               </w:rPr>
-              <w:t>) returns true when waypoints ‘x’ distance just above (0,00</w:t>
+              <w:t>) returns true when waypoints ‘x’ distance just above (</w:t>
             </w:r>
             <w:r>
               <w:rPr>
@@ -10581,7 +9882,7 @@
                 <w:lang w:val="en-US"/>
                 <w14:ligatures w14:val="none"/>
               </w:rPr>
-              <w:t>0</w:t>
+              <w:t>0.0001 tolerance</w:t>
             </w:r>
             <w:r>
               <w:rPr>
@@ -10594,7 +9895,7 @@
                 <w:lang w:val="en-US"/>
                 <w14:ligatures w14:val="none"/>
               </w:rPr>
-              <w:t xml:space="preserve">1 tolerance) at </w:t>
+              <w:t xml:space="preserve">) at </w:t>
             </w:r>
             <w:r>
               <w:rPr>
@@ -10827,7 +10128,7 @@
                 <w:lang w:val="en-US"/>
                 <w14:ligatures w14:val="none"/>
               </w:rPr>
-              <w:t>) returns False when waypoints ‘x’ distance just below (0,00</w:t>
+              <w:t>) returns False when waypoints ‘x’ distance just below (</w:t>
             </w:r>
             <w:r>
               <w:rPr>
@@ -10840,7 +10141,7 @@
                 <w:lang w:val="en-US"/>
                 <w14:ligatures w14:val="none"/>
               </w:rPr>
-              <w:t>0</w:t>
+              <w:t>0.0001 tolerance</w:t>
             </w:r>
             <w:r>
               <w:rPr>
@@ -10853,7 +10154,7 @@
                 <w:lang w:val="en-US"/>
                 <w14:ligatures w14:val="none"/>
               </w:rPr>
-              <w:t xml:space="preserve">1 tolerance) at </w:t>
+              <w:t xml:space="preserve">) at </w:t>
             </w:r>
             <w:r>
               <w:rPr>
@@ -11177,7 +10478,7 @@
                 <w:lang w:val="en-US"/>
                 <w14:ligatures w14:val="none"/>
               </w:rPr>
-              <w:t>) returns true when waypoints ‘y’ distance just above (0,0</w:t>
+              <w:t>) returns true when waypoints ‘y’ distance just above (</w:t>
             </w:r>
             <w:r>
               <w:rPr>
@@ -11190,7 +10491,7 @@
                 <w:lang w:val="en-US"/>
                 <w14:ligatures w14:val="none"/>
               </w:rPr>
-              <w:t>0</w:t>
+              <w:t>0.0001 tolerance</w:t>
             </w:r>
             <w:r>
               <w:rPr>
@@ -11203,7 +10504,7 @@
                 <w:lang w:val="en-US"/>
                 <w14:ligatures w14:val="none"/>
               </w:rPr>
-              <w:t xml:space="preserve">01 tolerance) at </w:t>
+              <w:t xml:space="preserve">) at </w:t>
             </w:r>
             <w:r>
               <w:rPr>
@@ -11362,7 +10663,7 @@
                 <w:lang w:val="en-US"/>
                 <w14:ligatures w14:val="none"/>
               </w:rPr>
-              <w:t>) returns False when waypoints ‘y’ distance just below (0,0</w:t>
+              <w:t>) returns False when waypoints ‘y’ distance just below (</w:t>
             </w:r>
             <w:r>
               <w:rPr>
@@ -11375,7 +10676,7 @@
                 <w:lang w:val="en-US"/>
                 <w14:ligatures w14:val="none"/>
               </w:rPr>
-              <w:t>0</w:t>
+              <w:t>0.0001 tolerance</w:t>
             </w:r>
             <w:r>
               <w:rPr>
@@ -11388,7 +10689,7 @@
                 <w:lang w:val="en-US"/>
                 <w14:ligatures w14:val="none"/>
               </w:rPr>
-              <w:t xml:space="preserve">01 tolerance) at </w:t>
+              <w:t xml:space="preserve">) at </w:t>
             </w:r>
             <w:r>
               <w:rPr>
@@ -18495,7 +17796,7 @@
         </w:trPr>
         <w:tc>
           <w:tcPr>
-            <w:tcW w:w="2041" w:type="pct"/>
+            <w:tcW w:w="2062" w:type="pct"/>
             <w:shd w:val="clear" w:color="auto" w:fill="A6A6A6" w:themeFill="background1" w:themeFillShade="A6"/>
           </w:tcPr>
           <w:p>
@@ -18509,7 +17810,7 @@
         </w:tc>
         <w:tc>
           <w:tcPr>
-            <w:tcW w:w="2959" w:type="pct"/>
+            <w:tcW w:w="2938" w:type="pct"/>
             <w:shd w:val="clear" w:color="auto" w:fill="A6A6A6" w:themeFill="background1" w:themeFillShade="A6"/>
           </w:tcPr>
           <w:p>
@@ -18525,7 +17826,7 @@
       <w:tr>
         <w:tc>
           <w:tcPr>
-            <w:tcW w:w="2041" w:type="pct"/>
+            <w:tcW w:w="2062" w:type="pct"/>
             <w:vAlign w:val="bottom"/>
           </w:tcPr>
           <w:p>
@@ -18560,7 +17861,7 @@
         </w:tc>
         <w:tc>
           <w:tcPr>
-            <w:tcW w:w="2959" w:type="pct"/>
+            <w:tcW w:w="2938" w:type="pct"/>
             <w:vAlign w:val="bottom"/>
           </w:tcPr>
           <w:p>
@@ -18576,7 +17877,7 @@
       <w:tr>
         <w:tc>
           <w:tcPr>
-            <w:tcW w:w="2041" w:type="pct"/>
+            <w:tcW w:w="2062" w:type="pct"/>
             <w:vAlign w:val="bottom"/>
           </w:tcPr>
           <w:p>
@@ -18611,7 +17912,7 @@
         </w:tc>
         <w:tc>
           <w:tcPr>
-            <w:tcW w:w="2959" w:type="pct"/>
+            <w:tcW w:w="2938" w:type="pct"/>
             <w:vAlign w:val="bottom"/>
           </w:tcPr>
           <w:p>
@@ -18627,7 +17928,7 @@
       <w:tr>
         <w:tc>
           <w:tcPr>
-            <w:tcW w:w="2041" w:type="pct"/>
+            <w:tcW w:w="2062" w:type="pct"/>
             <w:vAlign w:val="bottom"/>
           </w:tcPr>
           <w:p>
@@ -18659,7 +17960,7 @@
         </w:tc>
         <w:tc>
           <w:tcPr>
-            <w:tcW w:w="2959" w:type="pct"/>
+            <w:tcW w:w="2938" w:type="pct"/>
             <w:vAlign w:val="bottom"/>
           </w:tcPr>
           <w:p>
@@ -18681,7 +17982,7 @@
       <w:tr>
         <w:tc>
           <w:tcPr>
-            <w:tcW w:w="2041" w:type="pct"/>
+            <w:tcW w:w="2062" w:type="pct"/>
             <w:vAlign w:val="bottom"/>
           </w:tcPr>
           <w:p>
@@ -18713,7 +18014,7 @@
         </w:tc>
         <w:tc>
           <w:tcPr>
-            <w:tcW w:w="2959" w:type="pct"/>
+            <w:tcW w:w="2938" w:type="pct"/>
             <w:vAlign w:val="bottom"/>
           </w:tcPr>
           <w:p>
@@ -18729,7 +18030,7 @@
       <w:tr>
         <w:tc>
           <w:tcPr>
-            <w:tcW w:w="2041" w:type="pct"/>
+            <w:tcW w:w="2062" w:type="pct"/>
             <w:vAlign w:val="bottom"/>
           </w:tcPr>
           <w:p>
@@ -18761,7 +18062,7 @@
         </w:tc>
         <w:tc>
           <w:tcPr>
-            <w:tcW w:w="2959" w:type="pct"/>
+            <w:tcW w:w="2938" w:type="pct"/>
             <w:vAlign w:val="bottom"/>
           </w:tcPr>
           <w:p>
@@ -18783,7 +18084,7 @@
       <w:tr>
         <w:tc>
           <w:tcPr>
-            <w:tcW w:w="2041" w:type="pct"/>
+            <w:tcW w:w="2062" w:type="pct"/>
             <w:vAlign w:val="bottom"/>
           </w:tcPr>
           <w:p>
@@ -18815,7 +18116,7 @@
         </w:tc>
         <w:tc>
           <w:tcPr>
-            <w:tcW w:w="2959" w:type="pct"/>
+            <w:tcW w:w="2938" w:type="pct"/>
             <w:vAlign w:val="bottom"/>
           </w:tcPr>
           <w:p>
@@ -18831,7 +18132,7 @@
       <w:tr>
         <w:tc>
           <w:tcPr>
-            <w:tcW w:w="2041" w:type="pct"/>
+            <w:tcW w:w="2062" w:type="pct"/>
             <w:vAlign w:val="bottom"/>
           </w:tcPr>
           <w:p>
@@ -18863,7 +18164,7 @@
         </w:tc>
         <w:tc>
           <w:tcPr>
-            <w:tcW w:w="2959" w:type="pct"/>
+            <w:tcW w:w="2938" w:type="pct"/>
             <w:vAlign w:val="bottom"/>
           </w:tcPr>
           <w:p>
@@ -18882,7 +18183,7 @@
       <w:tr>
         <w:tc>
           <w:tcPr>
-            <w:tcW w:w="2041" w:type="pct"/>
+            <w:tcW w:w="2062" w:type="pct"/>
             <w:vAlign w:val="bottom"/>
           </w:tcPr>
           <w:p>
@@ -18906,7 +18207,7 @@
         </w:tc>
         <w:tc>
           <w:tcPr>
-            <w:tcW w:w="2959" w:type="pct"/>
+            <w:tcW w:w="2938" w:type="pct"/>
             <w:vAlign w:val="bottom"/>
           </w:tcPr>
           <w:p>
@@ -18922,7 +18223,7 @@
       <w:tr>
         <w:tc>
           <w:tcPr>
-            <w:tcW w:w="2041" w:type="pct"/>
+            <w:tcW w:w="2062" w:type="pct"/>
             <w:vAlign w:val="bottom"/>
           </w:tcPr>
           <w:p>
@@ -18967,7 +18268,7 @@
         </w:tc>
         <w:tc>
           <w:tcPr>
-            <w:tcW w:w="2959" w:type="pct"/>
+            <w:tcW w:w="2938" w:type="pct"/>
             <w:vAlign w:val="bottom"/>
           </w:tcPr>
           <w:p>
@@ -18983,7 +18284,7 @@
       <w:tr>
         <w:tc>
           <w:tcPr>
-            <w:tcW w:w="2041" w:type="pct"/>
+            <w:tcW w:w="2062" w:type="pct"/>
             <w:vAlign w:val="bottom"/>
           </w:tcPr>
           <w:p>
@@ -19015,7 +18316,7 @@
         </w:tc>
         <w:tc>
           <w:tcPr>
-            <w:tcW w:w="2959" w:type="pct"/>
+            <w:tcW w:w="2938" w:type="pct"/>
             <w:vAlign w:val="bottom"/>
           </w:tcPr>
           <w:p>
@@ -19023,7 +18324,19 @@
               <w:pStyle w:val="CellBody"/>
             </w:pPr>
             <w:r>
-              <w:t>SDD-021, SRD-002, SYS-001</w:t>
+              <w:t xml:space="preserve">SDD-021, </w:t>
+            </w:r>
+            <w:r>
+              <w:t>SDD-02</w:t>
+            </w:r>
+            <w:r>
+              <w:t>2</w:t>
+            </w:r>
+            <w:r>
+              <w:t xml:space="preserve">, </w:t>
+            </w:r>
+            <w:r>
+              <w:t>SRD-002, SYS-001</w:t>
             </w:r>
           </w:p>
         </w:tc>
@@ -19031,7 +18344,7 @@
       <w:tr>
         <w:tc>
           <w:tcPr>
-            <w:tcW w:w="2041" w:type="pct"/>
+            <w:tcW w:w="2062" w:type="pct"/>
             <w:vAlign w:val="bottom"/>
           </w:tcPr>
           <w:p>
@@ -19063,7 +18376,7 @@
         </w:tc>
         <w:tc>
           <w:tcPr>
-            <w:tcW w:w="2959" w:type="pct"/>
+            <w:tcW w:w="2938" w:type="pct"/>
             <w:vAlign w:val="bottom"/>
           </w:tcPr>
           <w:p>
@@ -19071,7 +18384,7 @@
               <w:pStyle w:val="CellBody"/>
             </w:pPr>
             <w:r>
-              <w:t>SDD-021 (zoom — no dedicated SRD; implementation detail)</w:t>
+              <w:t xml:space="preserve">SDD-021 </w:t>
             </w:r>
           </w:p>
         </w:tc>
@@ -19079,7 +18392,7 @@
       <w:tr>
         <w:tc>
           <w:tcPr>
-            <w:tcW w:w="2041" w:type="pct"/>
+            <w:tcW w:w="2062" w:type="pct"/>
             <w:vAlign w:val="bottom"/>
           </w:tcPr>
           <w:p>
@@ -19098,7 +18411,7 @@
             </w:r>
             <w:proofErr w:type="spellStart"/>
             <w:r>
-              <w:t>redrawLines</w:t>
+              <w:t>refreshColors</w:t>
             </w:r>
             <w:proofErr w:type="spellEnd"/>
             <w:r>
@@ -19112,7 +18425,7 @@
         </w:tc>
         <w:tc>
           <w:tcPr>
-            <w:tcW w:w="2959" w:type="pct"/>
+            <w:tcW w:w="2938" w:type="pct"/>
             <w:vAlign w:val="bottom"/>
           </w:tcPr>
           <w:p>
@@ -19120,7 +18433,7 @@
               <w:pStyle w:val="CellBody"/>
             </w:pPr>
             <w:r>
-              <w:t>SDD-022, SRD-003</w:t>
+              <w:t>SDD-023, SRD-004</w:t>
             </w:r>
           </w:p>
         </w:tc>
@@ -19128,7 +18441,7 @@
       <w:tr>
         <w:tc>
           <w:tcPr>
-            <w:tcW w:w="2041" w:type="pct"/>
+            <w:tcW w:w="2062" w:type="pct"/>
             <w:vAlign w:val="bottom"/>
           </w:tcPr>
           <w:p>
@@ -19146,7 +18459,7 @@
             </w:r>
             <w:proofErr w:type="spellStart"/>
             <w:r>
-              <w:t>refreshColors</w:t>
+              <w:t>removeLastWaypoint</w:t>
             </w:r>
             <w:proofErr w:type="spellEnd"/>
             <w:r>
@@ -19160,7 +18473,7 @@
         </w:tc>
         <w:tc>
           <w:tcPr>
-            <w:tcW w:w="2959" w:type="pct"/>
+            <w:tcW w:w="2938" w:type="pct"/>
             <w:vAlign w:val="bottom"/>
           </w:tcPr>
           <w:p>
@@ -19168,7 +18481,7 @@
               <w:pStyle w:val="CellBody"/>
             </w:pPr>
             <w:r>
-              <w:t>SDD-023, SRD-004</w:t>
+              <w:t>SDD-024, SRD-005</w:t>
             </w:r>
           </w:p>
         </w:tc>
@@ -19176,7 +18489,7 @@
       <w:tr>
         <w:tc>
           <w:tcPr>
-            <w:tcW w:w="2041" w:type="pct"/>
+            <w:tcW w:w="2062" w:type="pct"/>
             <w:vAlign w:val="bottom"/>
           </w:tcPr>
           <w:p>
@@ -19194,7 +18507,7 @@
             </w:r>
             <w:proofErr w:type="spellStart"/>
             <w:r>
-              <w:t>removeLastWaypoint</w:t>
+              <w:t>clearAll</w:t>
             </w:r>
             <w:proofErr w:type="spellEnd"/>
             <w:r>
@@ -19208,7 +18521,7 @@
         </w:tc>
         <w:tc>
           <w:tcPr>
-            <w:tcW w:w="2959" w:type="pct"/>
+            <w:tcW w:w="2938" w:type="pct"/>
             <w:vAlign w:val="bottom"/>
           </w:tcPr>
           <w:p>
@@ -19216,7 +18529,7 @@
               <w:pStyle w:val="CellBody"/>
             </w:pPr>
             <w:r>
-              <w:t>SDD-024, SRD-005</w:t>
+              <w:t>SDD-025, SRD-006</w:t>
             </w:r>
           </w:p>
         </w:tc>
@@ -19224,7 +18537,7 @@
       <w:tr>
         <w:tc>
           <w:tcPr>
-            <w:tcW w:w="2041" w:type="pct"/>
+            <w:tcW w:w="2062" w:type="pct"/>
             <w:vAlign w:val="bottom"/>
           </w:tcPr>
           <w:p>
@@ -19234,7 +18547,7 @@
             <w:proofErr w:type="spellStart"/>
             <w:proofErr w:type="gramStart"/>
             <w:r>
-              <w:t>MapEngine</w:t>
+              <w:t>MainWindow</w:t>
             </w:r>
             <w:proofErr w:type="spellEnd"/>
             <w:r>
@@ -19242,7 +18555,7 @@
             </w:r>
             <w:proofErr w:type="spellStart"/>
             <w:r>
-              <w:t>clearAll</w:t>
+              <w:t>onWaypointAdded</w:t>
             </w:r>
             <w:proofErr w:type="spellEnd"/>
             <w:r>
@@ -19256,7 +18569,7 @@
         </w:tc>
         <w:tc>
           <w:tcPr>
-            <w:tcW w:w="2959" w:type="pct"/>
+            <w:tcW w:w="2938" w:type="pct"/>
             <w:vAlign w:val="bottom"/>
           </w:tcPr>
           <w:p>
@@ -19264,7 +18577,15 @@
               <w:pStyle w:val="CellBody"/>
             </w:pPr>
             <w:r>
-              <w:t>SDD-025, SRD-006</w:t>
+              <w:t>SDD-</w:t>
+            </w:r>
+            <w:proofErr w:type="gramStart"/>
+            <w:r>
+              <w:t>001,SRD</w:t>
+            </w:r>
+            <w:proofErr w:type="gramEnd"/>
+            <w:r>
+              <w:t>-010</w:t>
             </w:r>
           </w:p>
         </w:tc>
@@ -19272,7 +18593,7 @@
       <w:tr>
         <w:tc>
           <w:tcPr>
-            <w:tcW w:w="2041" w:type="pct"/>
+            <w:tcW w:w="2062" w:type="pct"/>
             <w:vAlign w:val="bottom"/>
           </w:tcPr>
           <w:p>
@@ -19290,7 +18611,7 @@
             </w:r>
             <w:proofErr w:type="spellStart"/>
             <w:r>
-              <w:t>onUpload</w:t>
+              <w:t>onWaypointRemoved</w:t>
             </w:r>
             <w:proofErr w:type="spellEnd"/>
             <w:r>
@@ -19304,7 +18625,7 @@
         </w:tc>
         <w:tc>
           <w:tcPr>
-            <w:tcW w:w="2959" w:type="pct"/>
+            <w:tcW w:w="2938" w:type="pct"/>
             <w:vAlign w:val="bottom"/>
           </w:tcPr>
           <w:p>
@@ -19312,7 +18633,18 @@
               <w:pStyle w:val="CellBody"/>
             </w:pPr>
             <w:r>
-              <w:t>SDD-030, SDD-031, SDD-032, SDD-041, SRD-020, SRD-021, SYS-005</w:t>
+              <w:t>SDD-</w:t>
+            </w:r>
+            <w:proofErr w:type="gramStart"/>
+            <w:r>
+              <w:t>001,SRD</w:t>
+            </w:r>
+            <w:proofErr w:type="gramEnd"/>
+            <w:r>
+              <w:t>-0</w:t>
+            </w:r>
+            <w:r>
+              <w:t>05</w:t>
             </w:r>
           </w:p>
         </w:tc>
@@ -19320,7 +18652,7 @@
       <w:tr>
         <w:tc>
           <w:tcPr>
-            <w:tcW w:w="2041" w:type="pct"/>
+            <w:tcW w:w="2062" w:type="pct"/>
             <w:vAlign w:val="bottom"/>
           </w:tcPr>
           <w:p>
@@ -19338,7 +18670,7 @@
             </w:r>
             <w:proofErr w:type="spellStart"/>
             <w:r>
-              <w:t>onClear</w:t>
+              <w:t>onUpload</w:t>
             </w:r>
             <w:proofErr w:type="spellEnd"/>
             <w:r>
@@ -19352,7 +18684,7 @@
         </w:tc>
         <w:tc>
           <w:tcPr>
-            <w:tcW w:w="2959" w:type="pct"/>
+            <w:tcW w:w="2938" w:type="pct"/>
             <w:vAlign w:val="bottom"/>
           </w:tcPr>
           <w:p>
@@ -19360,7 +18692,7 @@
               <w:pStyle w:val="CellBody"/>
             </w:pPr>
             <w:r>
-              <w:t>SDD-043, SRD-006</w:t>
+              <w:t>SDD-030, SDD-031, SDD-032, SDD-041, SRD-020, SRD-021, SYS-005</w:t>
             </w:r>
           </w:p>
         </w:tc>
@@ -19368,7 +18700,7 @@
       <w:tr>
         <w:tc>
           <w:tcPr>
-            <w:tcW w:w="2041" w:type="pct"/>
+            <w:tcW w:w="2062" w:type="pct"/>
             <w:vAlign w:val="bottom"/>
           </w:tcPr>
           <w:p>
@@ -19386,7 +18718,7 @@
             </w:r>
             <w:proofErr w:type="spellStart"/>
             <w:r>
-              <w:t>updateStatus</w:t>
+              <w:t>onClear</w:t>
             </w:r>
             <w:proofErr w:type="spellEnd"/>
             <w:r>
@@ -19400,7 +18732,7 @@
         </w:tc>
         <w:tc>
           <w:tcPr>
-            <w:tcW w:w="2959" w:type="pct"/>
+            <w:tcW w:w="2938" w:type="pct"/>
             <w:vAlign w:val="bottom"/>
           </w:tcPr>
           <w:p>
@@ -19408,7 +18740,7 @@
               <w:pStyle w:val="CellBody"/>
             </w:pPr>
             <w:r>
-              <w:t>SDD-051, SDD-052, SDD-053, SDD-054, SRD-007</w:t>
+              <w:t>SDD-043, SRD-006</w:t>
             </w:r>
           </w:p>
         </w:tc>
@@ -19416,7 +18748,7 @@
       <w:tr>
         <w:tc>
           <w:tcPr>
-            <w:tcW w:w="2041" w:type="pct"/>
+            <w:tcW w:w="2062" w:type="pct"/>
             <w:vAlign w:val="bottom"/>
           </w:tcPr>
           <w:p>
@@ -19432,26 +18764,23 @@
             <w:r>
               <w:t>::</w:t>
             </w:r>
+            <w:proofErr w:type="spellStart"/>
+            <w:r>
+              <w:t>updateStatus</w:t>
+            </w:r>
+            <w:proofErr w:type="spellEnd"/>
+            <w:r>
+              <w:t>(</w:t>
+            </w:r>
             <w:proofErr w:type="gramEnd"/>
             <w:r>
-              <w:t xml:space="preserve"> </w:t>
-            </w:r>
-            <w:proofErr w:type="spellStart"/>
-            <w:r>
-              <w:t>setupLogPanel</w:t>
-            </w:r>
-            <w:proofErr w:type="spellEnd"/>
-            <w:r>
-              <w:t xml:space="preserve"> </w:t>
-            </w:r>
-            <w:r>
-              <w:t>()</w:t>
-            </w:r>
-          </w:p>
-        </w:tc>
-        <w:tc>
-          <w:tcPr>
-            <w:tcW w:w="2959" w:type="pct"/>
+              <w:t>)</w:t>
+            </w:r>
+          </w:p>
+        </w:tc>
+        <w:tc>
+          <w:tcPr>
+            <w:tcW w:w="2938" w:type="pct"/>
             <w:vAlign w:val="bottom"/>
           </w:tcPr>
           <w:p>
@@ -19459,7 +18788,7 @@
               <w:pStyle w:val="CellBody"/>
             </w:pPr>
             <w:r>
-              <w:t>SDD-030, SDD-031, SDD-032</w:t>
+              <w:t>SDD-051, SDD-052, SDD-053, SDD-054, SRD-007</w:t>
             </w:r>
           </w:p>
         </w:tc>
@@ -19467,7 +18796,7 @@
       <w:tr>
         <w:tc>
           <w:tcPr>
-            <w:tcW w:w="2041" w:type="pct"/>
+            <w:tcW w:w="2062" w:type="pct"/>
             <w:vAlign w:val="bottom"/>
           </w:tcPr>
           <w:p>
@@ -19475,18 +18804,31 @@
               <w:pStyle w:val="CellBody"/>
             </w:pPr>
             <w:proofErr w:type="spellStart"/>
+            <w:proofErr w:type="gramStart"/>
             <w:r>
               <w:t>MainWindow</w:t>
             </w:r>
             <w:proofErr w:type="spellEnd"/>
             <w:r>
-              <w:t xml:space="preserve"> (toolbar setup)</w:t>
-            </w:r>
-          </w:p>
-        </w:tc>
-        <w:tc>
-          <w:tcPr>
-            <w:tcW w:w="2959" w:type="pct"/>
+              <w:t>::</w:t>
+            </w:r>
+            <w:proofErr w:type="spellStart"/>
+            <w:r>
+              <w:t>setupLogPanel</w:t>
+            </w:r>
+            <w:proofErr w:type="spellEnd"/>
+            <w:r>
+              <w:t>(</w:t>
+            </w:r>
+            <w:proofErr w:type="gramEnd"/>
+            <w:r>
+              <w:t>)</w:t>
+            </w:r>
+          </w:p>
+        </w:tc>
+        <w:tc>
+          <w:tcPr>
+            <w:tcW w:w="2938" w:type="pct"/>
             <w:vAlign w:val="bottom"/>
           </w:tcPr>
           <w:p>
@@ -19494,7 +18836,7 @@
               <w:pStyle w:val="CellBody"/>
             </w:pPr>
             <w:r>
-              <w:t>SDD-041, SDD-042, SDD-043</w:t>
+              <w:t>SDD-030, SDD-031, SDD-032</w:t>
             </w:r>
           </w:p>
         </w:tc>
@@ -19502,7 +18844,7 @@
       <w:tr>
         <w:tc>
           <w:tcPr>
-            <w:tcW w:w="2041" w:type="pct"/>
+            <w:tcW w:w="2062" w:type="pct"/>
             <w:vAlign w:val="bottom"/>
           </w:tcPr>
           <w:p>
@@ -19510,21 +18852,31 @@
               <w:pStyle w:val="CellBody"/>
             </w:pPr>
             <w:proofErr w:type="spellStart"/>
-            <w:r>
-              <w:t>missionPlanTest</w:t>
+            <w:proofErr w:type="gramStart"/>
+            <w:r>
+              <w:t>MainWindow</w:t>
             </w:r>
             <w:proofErr w:type="spellEnd"/>
             <w:r>
-              <w:t>/tst_testmissionplanner</w:t>
-            </w:r>
-            <w:r>
-              <w:t>.cpp</w:t>
-            </w:r>
-          </w:p>
-        </w:tc>
-        <w:tc>
-          <w:tcPr>
-            <w:tcW w:w="2959" w:type="pct"/>
+              <w:t>::</w:t>
+            </w:r>
+            <w:proofErr w:type="spellStart"/>
+            <w:r>
+              <w:t>logMessage</w:t>
+            </w:r>
+            <w:proofErr w:type="spellEnd"/>
+            <w:r>
+              <w:t>(</w:t>
+            </w:r>
+            <w:proofErr w:type="gramEnd"/>
+            <w:r>
+              <w:t>)</w:t>
+            </w:r>
+          </w:p>
+        </w:tc>
+        <w:tc>
+          <w:tcPr>
+            <w:tcW w:w="2938" w:type="pct"/>
             <w:vAlign w:val="bottom"/>
           </w:tcPr>
           <w:p>
@@ -19532,22 +18884,7 @@
               <w:pStyle w:val="CellBody"/>
             </w:pPr>
             <w:r>
-              <w:t>SYS-008, T</w:t>
-            </w:r>
-            <w:r>
-              <w:t>EST</w:t>
-            </w:r>
-            <w:r>
-              <w:t xml:space="preserve">-001 to </w:t>
-            </w:r>
-            <w:r>
-              <w:t>TEST</w:t>
-            </w:r>
-            <w:r>
-              <w:t>-02</w:t>
-            </w:r>
-            <w:r>
-              <w:t>5</w:t>
+              <w:t>SDD-030, SDD-032</w:t>
             </w:r>
           </w:p>
         </w:tc>
@@ -19555,13 +18892,101 @@
       <w:tr>
         <w:tc>
           <w:tcPr>
-            <w:tcW w:w="2041" w:type="pct"/>
+            <w:tcW w:w="2062" w:type="pct"/>
             <w:vAlign w:val="bottom"/>
           </w:tcPr>
           <w:p>
             <w:pPr>
               <w:pStyle w:val="CellBody"/>
             </w:pPr>
+            <w:proofErr w:type="spellStart"/>
+            <w:r>
+              <w:t>MainWindow</w:t>
+            </w:r>
+            <w:proofErr w:type="spellEnd"/>
+            <w:r>
+              <w:t xml:space="preserve"> (toolbar setup)</w:t>
+            </w:r>
+          </w:p>
+        </w:tc>
+        <w:tc>
+          <w:tcPr>
+            <w:tcW w:w="2938" w:type="pct"/>
+            <w:vAlign w:val="bottom"/>
+          </w:tcPr>
+          <w:p>
+            <w:pPr>
+              <w:pStyle w:val="CellBody"/>
+            </w:pPr>
+            <w:r>
+              <w:t>SDD-041, SDD-042, SDD-043</w:t>
+            </w:r>
+          </w:p>
+        </w:tc>
+      </w:tr>
+      <w:tr>
+        <w:tc>
+          <w:tcPr>
+            <w:tcW w:w="2062" w:type="pct"/>
+            <w:vAlign w:val="bottom"/>
+          </w:tcPr>
+          <w:p>
+            <w:pPr>
+              <w:pStyle w:val="CellBody"/>
+            </w:pPr>
+            <w:proofErr w:type="spellStart"/>
+            <w:r>
+              <w:t>missionPlanTest</w:t>
+            </w:r>
+            <w:proofErr w:type="spellEnd"/>
+            <w:r>
+              <w:t>/tst_testmissionplanner</w:t>
+            </w:r>
+            <w:r>
+              <w:t>.cpp</w:t>
+            </w:r>
+          </w:p>
+        </w:tc>
+        <w:tc>
+          <w:tcPr>
+            <w:tcW w:w="2938" w:type="pct"/>
+            <w:vAlign w:val="bottom"/>
+          </w:tcPr>
+          <w:p>
+            <w:pPr>
+              <w:pStyle w:val="CellBody"/>
+            </w:pPr>
+            <w:r>
+              <w:t>SYS-008, T</w:t>
+            </w:r>
+            <w:r>
+              <w:t>EST</w:t>
+            </w:r>
+            <w:r>
+              <w:t xml:space="preserve">-001 to </w:t>
+            </w:r>
+            <w:r>
+              <w:t>TEST</w:t>
+            </w:r>
+            <w:r>
+              <w:t>-02</w:t>
+            </w:r>
+            <w:r>
+              <w:t>5</w:t>
+            </w:r>
+          </w:p>
+        </w:tc>
+      </w:tr>
+      <w:tr>
+        <w:tc>
+          <w:tcPr>
+            <w:tcW w:w="2062" w:type="pct"/>
+            <w:vAlign w:val="bottom"/>
+          </w:tcPr>
+          <w:p>
+            <w:pPr>
+              <w:pStyle w:val="CellBody"/>
+            </w:pPr>
             <w:r>
               <w:t>tests/CMakeLists.txt</w:t>
             </w:r>
@@ -19569,7 +18994,7 @@
         </w:tc>
         <w:tc>
           <w:tcPr>
-            <w:tcW w:w="2959" w:type="pct"/>
+            <w:tcW w:w="2938" w:type="pct"/>
             <w:vAlign w:val="bottom"/>
           </w:tcPr>
           <w:p>
@@ -19592,14 +19017,12 @@
       </w:pPr>
     </w:p>
     <w:sectPr>
-      <w:headerReference w:type="default" r:id="rId10"/>
-      <w:footerReference w:type="default" r:id="rId11"/>
-      <w:headerReference w:type="first" r:id="rId12"/>
+      <w:headerReference w:type="default" r:id="rId8"/>
+      <w:footerReference w:type="default" r:id="rId9"/>
+      <w:headerReference w:type="first" r:id="rId10"/>
       <w:pgSz w:w="11906" w:h="16838"/>
       <w:pgMar w:top="1440" w:right="1440" w:bottom="1440" w:left="1440" w:header="431" w:footer="708" w:gutter="0"/>
-      <w:pgNumType w:start="0"/>
       <w:cols w:space="708"/>
-      <w:titlePg/>
       <w:docGrid w:linePitch="360"/>
     </w:sectPr>
   </w:body>
@@ -22940,8 +22363,10 @@
     <w:rsid w:val="005406A5"/>
     <w:rsid w:val="005D2AC4"/>
     <w:rsid w:val="00612146"/>
+    <w:rsid w:val="006621A5"/>
     <w:rsid w:val="006E56A0"/>
     <w:rsid w:val="006F0464"/>
+    <w:rsid w:val="00736C10"/>
     <w:rsid w:val="007F00CC"/>
     <w:rsid w:val="008B292A"/>
     <w:rsid w:val="008F16A2"/>

</xml_diff>